<commit_message>
After-build report and the impairment workbook updated for the second round: the chain complete to the ECL
Co-Authored-By: Claude Fable 5.1 <noreply@anthropic.com>
</commit_message>
<xml_diff>
--- a/docs/MAIIC_After_Build_Report_2026-10-08.docx
+++ b/docs/MAIIC_After_Build_Report_2026-10-08.docx
@@ -102,7 +102,7 @@
           <w:i w:val="0"/>
           <w:sz w:val="18"/>
         </w:rPr>
-        <w:t>a26ccec</w:t>
+        <w:t>09ac5da</w:t>
       </w:r>
       <w:r>
         <w:rPr>
@@ -1538,7 +1538,7 @@
                 <w:i w:val="0"/>
                 <w:sz w:val="17"/>
               </w:rPr>
-              <w:t>Steps 1 (macro), 3 (staging), 7 (ECL), 8 and 9 (EIR), 10 (reconciliation) run; 2, 4, 5, 6, 11, 12 are the screens' engines not yet callable without a request (section 6 below)</w:t>
+              <w:t>Steps 1 (macro), 2 (scenario set), 3 (staging), 4 (PD transition matrix), 5 (LGD cohort workout), 6 (forward-looking chain), 7 (ECL), 8 and 9 (EIR), 10 (reconciliation) run; 11 (stress) and 12 (reports and workbooks) remain the screens'</w:t>
             </w:r>
           </w:p>
         </w:tc>
@@ -1561,6 +1561,40 @@
                 <w:sz w:val="17"/>
               </w:rPr>
               <w:t>Bootstrap::stepEngines</w:t>
+            </w:r>
+            <w:r>
+              <w:rPr>
+                <w:b w:val="0"/>
+                <w:i w:val="0"/>
+                <w:sz w:val="17"/>
+              </w:rPr>
+              <w:t xml:space="preserve">, </w:t>
+            </w:r>
+            <w:r>
+              <w:rPr>
+                <w:rFonts w:ascii="Consolas" w:hAnsi="Consolas"/>
+                <w:b w:val="0"/>
+                <w:i w:val="0"/>
+                <w:sz w:val="17"/>
+              </w:rPr>
+              <w:t>PdEngineService</w:t>
+            </w:r>
+            <w:r>
+              <w:rPr>
+                <w:b w:val="0"/>
+                <w:i w:val="0"/>
+                <w:sz w:val="17"/>
+              </w:rPr>
+              <w:t xml:space="preserve">, </w:t>
+            </w:r>
+            <w:r>
+              <w:rPr>
+                <w:rFonts w:ascii="Consolas" w:hAnsi="Consolas"/>
+                <w:b w:val="0"/>
+                <w:i w:val="0"/>
+                <w:sz w:val="17"/>
+              </w:rPr>
+              <w:t>LgdEngineService</w:t>
             </w:r>
           </w:p>
         </w:tc>
@@ -2361,7 +2395,7 @@
                 <w:i w:val="0"/>
                 <w:sz w:val="17"/>
               </w:rPr>
-              <w:t>14.3 to 14.6, 15</w:t>
+              <w:t>14.3 to 14.6 Forward-looking chain</w:t>
             </w:r>
           </w:p>
         </w:tc>
@@ -2382,7 +2416,7 @@
                 <w:i w:val="0"/>
                 <w:sz w:val="17"/>
               </w:rPr>
-              <w:t>Guardrail, structural events, proxy deriver, profiler, correlation finder, regression, scenario sets</w:t>
+              <w:t>Guardrail, structural events, proxy deriver, profiler, correlation finder, regression</w:t>
             </w:r>
           </w:p>
         </w:tc>
@@ -2403,7 +2437,7 @@
                 <w:i w:val="0"/>
                 <w:sz w:val="17"/>
               </w:rPr>
-              <w:t xml:space="preserve">The suite's engines and their support classes are in </w:t>
+              <w:t xml:space="preserve">Yes: the suite's engines ported as they are over a bridge from MAIIC's tables; </w:t>
             </w:r>
             <w:r>
               <w:rPr>
@@ -2412,15 +2446,7 @@
                 <w:i w:val="0"/>
                 <w:sz w:val="17"/>
               </w:rPr>
-              <w:t>docs/reference</w:t>
-            </w:r>
-            <w:r>
-              <w:rPr>
-                <w:b w:val="0"/>
-                <w:i w:val="0"/>
-                <w:sz w:val="17"/>
-              </w:rPr>
-              <w:t xml:space="preserve"> complete; the adapter to MAIIC's tables is not yet written</w:t>
+              <w:t>fli:correlate</w:t>
             </w:r>
           </w:p>
         </w:tc>
@@ -2437,11 +2463,37 @@
             </w:r>
             <w:r>
               <w:rPr>
+                <w:rFonts w:ascii="Consolas" w:hAnsi="Consolas"/>
                 <w:b w:val="0"/>
                 <w:i w:val="0"/>
                 <w:sz w:val="17"/>
               </w:rPr>
-              <w:t>section 6</w:t>
+              <w:t>FliBridgeService</w:t>
+            </w:r>
+            <w:r>
+              <w:rPr>
+                <w:b w:val="0"/>
+                <w:i w:val="0"/>
+                <w:sz w:val="17"/>
+              </w:rPr>
+              <w:t xml:space="preserve">, </w:t>
+            </w:r>
+            <w:r>
+              <w:rPr>
+                <w:rFonts w:ascii="Consolas" w:hAnsi="Consolas"/>
+                <w:b w:val="0"/>
+                <w:i w:val="0"/>
+                <w:sz w:val="17"/>
+              </w:rPr>
+              <w:t>app/Services/Fli/*</w:t>
+            </w:r>
+            <w:r>
+              <w:rPr>
+                <w:b w:val="0"/>
+                <w:i w:val="0"/>
+                <w:sz w:val="17"/>
+              </w:rPr>
+              <w:t>, 1 test</w:t>
             </w:r>
           </w:p>
         </w:tc>
@@ -2464,7 +2516,7 @@
                 <w:i w:val="0"/>
                 <w:sz w:val="17"/>
               </w:rPr>
-              <w:t>12 Audit workbooks</w:t>
+              <w:t>15 Scenario sets</w:t>
             </w:r>
           </w:p>
         </w:tc>
@@ -2485,7 +2537,7 @@
                 <w:i w:val="0"/>
                 <w:sz w:val="17"/>
               </w:rPr>
-              <w:t>The compliance modules and workbooks</w:t>
+              <w:t>The governed set: rules, shocks on the base, approval, lock, versions, back-test, sensitivity; the first set of 15.8</w:t>
             </w:r>
           </w:p>
         </w:tc>
@@ -2506,7 +2558,7 @@
                 <w:i w:val="0"/>
                 <w:sz w:val="17"/>
               </w:rPr>
-              <w:t>Not started</w:t>
+              <w:t>Yes</w:t>
             </w:r>
           </w:p>
         </w:tc>
@@ -2523,11 +2575,141 @@
             </w:r>
             <w:r>
               <w:rPr>
+                <w:rFonts w:ascii="Consolas" w:hAnsi="Consolas"/>
                 <w:b w:val="0"/>
                 <w:i w:val="0"/>
                 <w:sz w:val="17"/>
               </w:rPr>
-              <w:t>section 6</w:t>
+              <w:t>ScenarioSetService</w:t>
+            </w:r>
+            <w:r>
+              <w:rPr>
+                <w:b w:val="0"/>
+                <w:i w:val="0"/>
+                <w:sz w:val="17"/>
+              </w:rPr>
+              <w:t xml:space="preserve">, </w:t>
+            </w:r>
+            <w:r>
+              <w:rPr>
+                <w:rFonts w:ascii="Consolas" w:hAnsi="Consolas"/>
+                <w:b w:val="0"/>
+                <w:i w:val="0"/>
+                <w:sz w:val="17"/>
+              </w:rPr>
+              <w:t>scenario:sets</w:t>
+            </w:r>
+            <w:r>
+              <w:rPr>
+                <w:b w:val="0"/>
+                <w:i w:val="0"/>
+                <w:sz w:val="17"/>
+              </w:rPr>
+              <w:t>, Governance Centre / Scenario Sets, 3 tests</w:t>
+            </w:r>
+          </w:p>
+        </w:tc>
+      </w:tr>
+      <w:tr>
+        <w:tc>
+          <w:tcPr>
+            <w:tcW w:type="dxa" w:w="2493"/>
+          </w:tcPr>
+          <w:p>
+            <w:r>
+              <w:rPr>
+                <w:b w:val="0"/>
+                <w:sz w:val="17"/>
+              </w:rPr>
+            </w:r>
+            <w:r>
+              <w:rPr>
+                <w:b w:val="0"/>
+                <w:i w:val="0"/>
+                <w:sz w:val="17"/>
+              </w:rPr>
+              <w:t>12 Audit workbooks</w:t>
+            </w:r>
+          </w:p>
+        </w:tc>
+        <w:tc>
+          <w:tcPr>
+            <w:tcW w:type="dxa" w:w="2493"/>
+          </w:tcPr>
+          <w:p>
+            <w:r>
+              <w:rPr>
+                <w:b w:val="0"/>
+                <w:sz w:val="17"/>
+              </w:rPr>
+            </w:r>
+            <w:r>
+              <w:rPr>
+                <w:b w:val="0"/>
+                <w:i w:val="0"/>
+                <w:sz w:val="17"/>
+              </w:rPr>
+              <w:t>The engine with the two columns and the Baselines sheet; the five modules</w:t>
+            </w:r>
+          </w:p>
+        </w:tc>
+        <w:tc>
+          <w:tcPr>
+            <w:tcW w:type="dxa" w:w="2493"/>
+          </w:tcPr>
+          <w:p>
+            <w:r>
+              <w:rPr>
+                <w:b w:val="0"/>
+                <w:sz w:val="17"/>
+              </w:rPr>
+            </w:r>
+            <w:r>
+              <w:rPr>
+                <w:b w:val="0"/>
+                <w:i w:val="0"/>
+                <w:sz w:val="17"/>
+              </w:rPr>
+              <w:t>Engine ported (CA-1); IFRS 9 EIR and impairment modules drafted and built in three formats (CA-2, part of CA-4); the register, trace and pack (CA-3) and three modules remain</w:t>
+            </w:r>
+          </w:p>
+        </w:tc>
+        <w:tc>
+          <w:tcPr>
+            <w:tcW w:type="dxa" w:w="2493"/>
+          </w:tcPr>
+          <w:p>
+            <w:r>
+              <w:rPr>
+                <w:b w:val="0"/>
+                <w:sz w:val="17"/>
+              </w:rPr>
+            </w:r>
+            <w:r>
+              <w:rPr>
+                <w:rFonts w:ascii="Consolas" w:hAnsi="Consolas"/>
+                <w:b w:val="0"/>
+                <w:i w:val="0"/>
+                <w:sz w:val="17"/>
+              </w:rPr>
+              <w:t>tools/compliance/</w:t>
+            </w:r>
+            <w:r>
+              <w:rPr>
+                <w:b w:val="0"/>
+                <w:i w:val="0"/>
+                <w:sz w:val="17"/>
+              </w:rPr>
+              <w:t xml:space="preserve">, </w:t>
+            </w:r>
+            <w:r>
+              <w:rPr>
+                <w:rFonts w:ascii="Consolas" w:hAnsi="Consolas"/>
+                <w:b w:val="0"/>
+                <w:i w:val="0"/>
+                <w:sz w:val="17"/>
+              </w:rPr>
+              <w:t>docs/compliance/</w:t>
             </w:r>
           </w:p>
         </w:tc>
@@ -2637,7 +2819,7 @@
           <w:b w:val="0"/>
           <w:i w:val="0"/>
         </w:rPr>
-        <w:t>The bootstrap on the wiped database, 8 October 2026 evening:</w:t>
+        <w:t>The bootstrap on the wiped database, 8 October 2026 evening, then the engine chain as completed in the second round (about 90 seconds in all):</w:t>
       </w:r>
     </w:p>
     <w:tbl>
@@ -3136,6 +3318,226 @@
                 <w:sz w:val="17"/>
               </w:rPr>
               <w:t>August 2026 computed on the pre-FLI PD</w:t>
+            </w:r>
+          </w:p>
+        </w:tc>
+      </w:tr>
+      <w:tr>
+        <w:tc>
+          <w:tcPr>
+            <w:tcW w:type="dxa" w:w="4986"/>
+          </w:tcPr>
+          <w:p>
+            <w:r>
+              <w:rPr>
+                <w:b w:val="0"/>
+                <w:sz w:val="17"/>
+              </w:rPr>
+            </w:r>
+            <w:r>
+              <w:rPr>
+                <w:b w:val="0"/>
+                <w:i w:val="0"/>
+                <w:sz w:val="17"/>
+              </w:rPr>
+              <w:t>PD</w:t>
+            </w:r>
+          </w:p>
+        </w:tc>
+        <w:tc>
+          <w:tcPr>
+            <w:tcW w:type="dxa" w:w="4986"/>
+          </w:tcPr>
+          <w:p>
+            <w:r>
+              <w:rPr>
+                <w:b w:val="0"/>
+                <w:sz w:val="17"/>
+              </w:rPr>
+            </w:r>
+            <w:r>
+              <w:rPr>
+                <w:b w:val="0"/>
+                <w:i w:val="0"/>
+                <w:sz w:val="17"/>
+              </w:rPr>
+              <w:t>Transition matrix over August 2025 to August 2026 (108 transitions): PD to Stage 3 of 35.9% from Stage 1 and 35.2% from Stage 2</w:t>
+            </w:r>
+          </w:p>
+        </w:tc>
+      </w:tr>
+      <w:tr>
+        <w:tc>
+          <w:tcPr>
+            <w:tcW w:type="dxa" w:w="4986"/>
+          </w:tcPr>
+          <w:p>
+            <w:r>
+              <w:rPr>
+                <w:b w:val="0"/>
+                <w:sz w:val="17"/>
+              </w:rPr>
+            </w:r>
+            <w:r>
+              <w:rPr>
+                <w:b w:val="0"/>
+                <w:i w:val="0"/>
+                <w:sz w:val="17"/>
+              </w:rPr>
+              <w:t>LGD</w:t>
+            </w:r>
+          </w:p>
+        </w:tc>
+        <w:tc>
+          <w:tcPr>
+            <w:tcW w:type="dxa" w:w="4986"/>
+          </w:tcPr>
+          <w:p>
+            <w:r>
+              <w:rPr>
+                <w:b w:val="0"/>
+                <w:sz w:val="17"/>
+              </w:rPr>
+            </w:r>
+            <w:r>
+              <w:rPr>
+                <w:b w:val="0"/>
+                <w:i w:val="0"/>
+                <w:sz w:val="17"/>
+              </w:rPr>
+              <w:t>Cohort of 41 Stage 3 loans (4.12bn) followed twelve months: cure 21.2%, recovery 23.5%, LGD 60.25%</w:t>
+            </w:r>
+          </w:p>
+        </w:tc>
+      </w:tr>
+      <w:tr>
+        <w:tc>
+          <w:tcPr>
+            <w:tcW w:type="dxa" w:w="4986"/>
+          </w:tcPr>
+          <w:p>
+            <w:r>
+              <w:rPr>
+                <w:b w:val="0"/>
+                <w:sz w:val="17"/>
+              </w:rPr>
+            </w:r>
+            <w:r>
+              <w:rPr>
+                <w:b w:val="0"/>
+                <w:i w:val="0"/>
+                <w:sz w:val="17"/>
+              </w:rPr>
+              <w:t>ECL, August 2026</w:t>
+            </w:r>
+          </w:p>
+        </w:tc>
+        <w:tc>
+          <w:tcPr>
+            <w:tcW w:type="dxa" w:w="4986"/>
+          </w:tcPr>
+          <w:p>
+            <w:r>
+              <w:rPr>
+                <w:b w:val="0"/>
+                <w:sz w:val="17"/>
+              </w:rPr>
+            </w:r>
+            <w:r>
+              <w:rPr>
+                <w:b w:val="0"/>
+                <w:i w:val="0"/>
+                <w:sz w:val="17"/>
+              </w:rPr>
+              <w:t>8.33bn on 23.32bn gross: Stage 1 1.58bn, Stage 2 1.82bn, Stage 3 4.93bn</w:t>
+            </w:r>
+          </w:p>
+        </w:tc>
+      </w:tr>
+      <w:tr>
+        <w:tc>
+          <w:tcPr>
+            <w:tcW w:type="dxa" w:w="4986"/>
+          </w:tcPr>
+          <w:p>
+            <w:r>
+              <w:rPr>
+                <w:b w:val="0"/>
+                <w:sz w:val="17"/>
+              </w:rPr>
+            </w:r>
+            <w:r>
+              <w:rPr>
+                <w:b w:val="0"/>
+                <w:i w:val="0"/>
+                <w:sz w:val="17"/>
+              </w:rPr>
+              <w:t>Scenario set</w:t>
+            </w:r>
+          </w:p>
+        </w:tc>
+        <w:tc>
+          <w:tcPr>
+            <w:tcW w:type="dxa" w:w="4986"/>
+          </w:tcPr>
+          <w:p>
+            <w:r>
+              <w:rPr>
+                <w:b w:val="0"/>
+                <w:sz w:val="17"/>
+              </w:rPr>
+            </w:r>
+            <w:r>
+              <w:rPr>
+                <w:b w:val="0"/>
+                <w:i w:val="0"/>
+                <w:sz w:val="17"/>
+              </w:rPr>
+              <w:t>The first set of 15.8 approved under the bootstrap label; sensitivity on 135 loans: base 9.63bn, upside 9.00bn, downside 11.10bn, severe 12.99bn, weighted 10.24bn</w:t>
+            </w:r>
+          </w:p>
+        </w:tc>
+      </w:tr>
+      <w:tr>
+        <w:tc>
+          <w:tcPr>
+            <w:tcW w:type="dxa" w:w="4986"/>
+          </w:tcPr>
+          <w:p>
+            <w:r>
+              <w:rPr>
+                <w:b w:val="0"/>
+                <w:sz w:val="17"/>
+              </w:rPr>
+            </w:r>
+            <w:r>
+              <w:rPr>
+                <w:b w:val="0"/>
+                <w:i w:val="0"/>
+                <w:sz w:val="17"/>
+              </w:rPr>
+              <w:t>Forward-looking chain</w:t>
+            </w:r>
+          </w:p>
+        </w:tc>
+        <w:tc>
+          <w:tcPr>
+            <w:tcW w:type="dxa" w:w="4986"/>
+          </w:tcPr>
+          <w:p>
+            <w:r>
+              <w:rPr>
+                <w:b w:val="0"/>
+                <w:sz w:val="17"/>
+              </w:rPr>
+            </w:r>
+            <w:r>
+              <w:rPr>
+                <w:b w:val="0"/>
+                <w:i w:val="0"/>
+                <w:sz w:val="17"/>
+              </w:rPr>
+              <w:t>1,045 driver x proxy x lag evaluations; 209 suggestions (55 recommended); 209 fits, 39 applied by the guardrail, 170 declined with reasons</w:t>
             </w:r>
           </w:p>
         </w:tc>
@@ -5052,7 +5454,7 @@
                 <w:i w:val="0"/>
                 <w:sz w:val="17"/>
               </w:rPr>
-              <w:t>The engines not yet callable without a request</w:t>
+              <w:t>Stress testing and the reports in the chain</w:t>
             </w:r>
           </w:p>
         </w:tc>
@@ -5073,7 +5475,7 @@
                 <w:i w:val="0"/>
                 <w:sz w:val="17"/>
               </w:rPr>
-              <w:t>6.10.1</w:t>
+              <w:t>6.10.1 steps 11, 12</w:t>
             </w:r>
           </w:p>
         </w:tc>
@@ -5094,7 +5496,7 @@
                 <w:i w:val="0"/>
                 <w:sz w:val="17"/>
               </w:rPr>
-              <w:t>PD transition matrices, LGD, the forward-looking route, stress testing and the reports run from their controllers today; the bootstrap records them as pending</w:t>
+              <w:t>Run from their screens today</w:t>
             </w:r>
           </w:p>
         </w:tc>
@@ -5115,7 +5517,7 @@
                 <w:i w:val="0"/>
                 <w:sz w:val="17"/>
               </w:rPr>
-              <w:t>Lift each controller's logic into a service; one day</w:t>
+              <w:t>Half a day each</w:t>
             </w:r>
           </w:p>
         </w:tc>
@@ -5138,7 +5540,7 @@
                 <w:i w:val="0"/>
                 <w:sz w:val="17"/>
               </w:rPr>
-              <w:t>Forward-looking chain</w:t>
+              <w:t>FLI Adjustments screen and the fit approval</w:t>
             </w:r>
           </w:p>
         </w:tc>
@@ -5159,7 +5561,7 @@
                 <w:i w:val="0"/>
                 <w:sz w:val="17"/>
               </w:rPr>
-              <w:t>14.3 to 14.6</w:t>
+              <w:t>14.6</w:t>
             </w:r>
           </w:p>
         </w:tc>
@@ -5180,24 +5582,7 @@
                 <w:i w:val="0"/>
                 <w:sz w:val="17"/>
               </w:rPr>
-              <w:t xml:space="preserve">Guardrail, structural events register, credit-loss proxy deriver, series profiler, correlation finder, repaired regression; the suite's code and its support classes are in </w:t>
-            </w:r>
-            <w:r>
-              <w:rPr>
-                <w:rFonts w:ascii="Consolas" w:hAnsi="Consolas"/>
-                <w:b w:val="0"/>
-                <w:i w:val="0"/>
-                <w:sz w:val="17"/>
-              </w:rPr>
-              <w:t>docs/reference</w:t>
-            </w:r>
-            <w:r>
-              <w:rPr>
-                <w:b w:val="0"/>
-                <w:i w:val="0"/>
-                <w:sz w:val="17"/>
-              </w:rPr>
-              <w:t xml:space="preserve"> complete</w:t>
+              <w:t>The chain's applied fits are proposals; a reviewer approves one on a screen and the route applies it per scenario</w:t>
             </w:r>
           </w:p>
         </w:tc>
@@ -5218,58 +5603,7 @@
                 <w:i w:val="0"/>
                 <w:sz w:val="17"/>
               </w:rPr>
-              <w:t>An adapter from MAIIC's tables (</w:t>
-            </w:r>
-            <w:r>
-              <w:rPr>
-                <w:rFonts w:ascii="Consolas" w:hAnsi="Consolas"/>
-                <w:b w:val="0"/>
-                <w:i w:val="0"/>
-                <w:sz w:val="17"/>
-              </w:rPr>
-              <w:t>macro_statistics_data</w:t>
-            </w:r>
-            <w:r>
-              <w:rPr>
-                <w:b w:val="0"/>
-                <w:i w:val="0"/>
-                <w:sz w:val="17"/>
-              </w:rPr>
-              <w:t xml:space="preserve">, </w:t>
-            </w:r>
-            <w:r>
-              <w:rPr>
-                <w:rFonts w:ascii="Consolas" w:hAnsi="Consolas"/>
-                <w:b w:val="0"/>
-                <w:i w:val="0"/>
-                <w:sz w:val="17"/>
-              </w:rPr>
-              <w:t>macro_credit_loss_data</w:t>
-            </w:r>
-            <w:r>
-              <w:rPr>
-                <w:b w:val="0"/>
-                <w:i w:val="0"/>
-                <w:sz w:val="17"/>
-              </w:rPr>
-              <w:t xml:space="preserve">, </w:t>
-            </w:r>
-            <w:r>
-              <w:rPr>
-                <w:rFonts w:ascii="Consolas" w:hAnsi="Consolas"/>
-                <w:b w:val="0"/>
-                <w:i w:val="0"/>
-                <w:sz w:val="17"/>
-              </w:rPr>
-              <w:t>governance_settings</w:t>
-            </w:r>
-            <w:r>
-              <w:rPr>
-                <w:b w:val="0"/>
-                <w:i w:val="0"/>
-                <w:sz w:val="17"/>
-              </w:rPr>
-              <w:t>, the transition matrices) to the engines' inputs; two to three days</w:t>
+              <w:t>One day</w:t>
             </w:r>
           </w:p>
         </w:tc>
@@ -5292,7 +5626,7 @@
                 <w:i w:val="0"/>
                 <w:sz w:val="17"/>
               </w:rPr>
-              <w:t>Scenario sets</w:t>
+              <w:t>The chain per scenario</w:t>
             </w:r>
           </w:p>
         </w:tc>
@@ -5313,7 +5647,7 @@
                 <w:i w:val="0"/>
                 <w:sz w:val="17"/>
               </w:rPr>
-              <w:t>15</w:t>
+              <w:t>15.5</w:t>
             </w:r>
           </w:p>
         </w:tc>
@@ -5334,7 +5668,7 @@
                 <w:i w:val="0"/>
                 <w:sz w:val="17"/>
               </w:rPr>
-              <w:t>Propose, approve, lock, versions, weights, back-test, sensitivity</w:t>
+              <w:t>The sensitivity uses the scenario multipliers; the full method runs the fitted relationship under each scenario's shocked path</w:t>
             </w:r>
           </w:p>
         </w:tc>
@@ -5355,16 +5689,7 @@
                 <w:i w:val="0"/>
                 <w:sz w:val="17"/>
               </w:rPr>
-              <w:t xml:space="preserve">Two days; the ZNBS controller and migrations are in </w:t>
-            </w:r>
-            <w:r>
-              <w:rPr>
-                <w:rFonts w:ascii="Consolas" w:hAnsi="Consolas"/>
-                <w:b w:val="0"/>
-                <w:i w:val="0"/>
-                <w:sz w:val="17"/>
-              </w:rPr>
-              <w:t>docs/reference</w:t>
+              <w:t>One day after the fit approval</w:t>
             </w:r>
           </w:p>
         </w:tc>
@@ -5429,7 +5754,7 @@
                 <w:i w:val="0"/>
                 <w:sz w:val="17"/>
               </w:rPr>
-              <w:t>The five-tab screen, the WEO parser, the policy-rate file tab</w:t>
+              <w:t>The five-tab screen, the WEO parser (the forecast years), the policy-rate file tab</w:t>
             </w:r>
           </w:p>
         </w:tc>
@@ -5473,7 +5798,7 @@
                 <w:i w:val="0"/>
                 <w:sz w:val="17"/>
               </w:rPr>
-              <w:t>Audit workbooks</w:t>
+              <w:t>Audit workbooks: register, trace, pack; three modules</w:t>
             </w:r>
           </w:p>
         </w:tc>
@@ -5494,7 +5819,7 @@
                 <w:i w:val="0"/>
                 <w:sz w:val="17"/>
               </w:rPr>
-              <w:t>12</w:t>
+              <w:t>12 (CA-3, rest of CA-4)</w:t>
             </w:r>
           </w:p>
         </w:tc>
@@ -5515,7 +5840,7 @@
                 <w:i w:val="0"/>
                 <w:sz w:val="17"/>
               </w:rPr>
-              <w:t>The compliance modules and the Baselines sheet</w:t>
+              <w:t>The register where MAIIC signs each row, the per-record trace, the auditor's pack; IFRS 7 / IAS 1, the RBM directive, Contract Schedule 1</w:t>
             </w:r>
           </w:p>
         </w:tc>
@@ -5536,33 +5861,7 @@
                 <w:i w:val="0"/>
                 <w:sz w:val="17"/>
               </w:rPr>
-              <w:t xml:space="preserve">Two days; </w:t>
-            </w:r>
-            <w:r>
-              <w:rPr>
-                <w:rFonts w:ascii="Consolas" w:hAnsi="Consolas"/>
-                <w:b w:val="0"/>
-                <w:i w:val="0"/>
-                <w:sz w:val="17"/>
-              </w:rPr>
-              <w:t>tools/compliance</w:t>
-            </w:r>
-            <w:r>
-              <w:rPr>
-                <w:b w:val="0"/>
-                <w:i w:val="0"/>
-                <w:sz w:val="17"/>
-              </w:rPr>
-              <w:t xml:space="preserve"> of the ZNBS suite is in </w:t>
-            </w:r>
-            <w:r>
-              <w:rPr>
-                <w:rFonts w:ascii="Consolas" w:hAnsi="Consolas"/>
-                <w:b w:val="0"/>
-                <w:i w:val="0"/>
-                <w:sz w:val="17"/>
-              </w:rPr>
-              <w:t>docs/reference</w:t>
+              <w:t>Two to three days</w:t>
             </w:r>
           </w:p>
         </w:tc>
@@ -5671,7 +5970,7 @@
                 <w:i w:val="0"/>
                 <w:sz w:val="17"/>
               </w:rPr>
-              <w:t>Dark-mode sweep</w:t>
+              <w:t>Dark-mode sweep; help texts; the user manual's navigation chapter</w:t>
             </w:r>
           </w:p>
         </w:tc>
@@ -5692,7 +5991,7 @@
                 <w:i w:val="0"/>
                 <w:sz w:val="17"/>
               </w:rPr>
-              <w:t>11.9</w:t>
+              <w:t>11.6, 11.9</w:t>
             </w:r>
           </w:p>
         </w:tc>
@@ -5713,7 +6012,7 @@
                 <w:i w:val="0"/>
                 <w:sz w:val="17"/>
               </w:rPr>
-              <w:t>The pages that style elements directly, group by group</w:t>
+              <w:t>The pages that style elements directly; fifteen passages; screenshots</w:t>
             </w:r>
           </w:p>
         </w:tc>
@@ -5734,7 +6033,7 @@
                 <w:i w:val="0"/>
                 <w:sz w:val="17"/>
               </w:rPr>
-              <w:t>Ongoing; the shell and shared classes are done</w:t>
+              <w:t>Ongoing; half a day for the texts</w:t>
             </w:r>
           </w:p>
         </w:tc>
@@ -5757,7 +6056,7 @@
                 <w:i w:val="0"/>
                 <w:sz w:val="17"/>
               </w:rPr>
-              <w:t>Help-centre texts and the user manual's navigation chapter</w:t>
+              <w:t>Tests for the PD and LGD services</w:t>
             </w:r>
           </w:p>
         </w:tc>
@@ -5778,7 +6077,7 @@
                 <w:i w:val="0"/>
                 <w:sz w:val="17"/>
               </w:rPr>
-              <w:t>11.6</w:t>
+              <w:t>6.10.1</w:t>
             </w:r>
           </w:p>
         </w:tc>
@@ -5799,7 +6098,7 @@
                 <w:i w:val="0"/>
                 <w:sz w:val="17"/>
               </w:rPr>
-              <w:t>Re-worded for the new groups; screenshots retaken</w:t>
+              <w:t>The engines are proven by the bootstrap run; unit tests on a fixture are owed</w:t>
             </w:r>
           </w:p>
         </w:tc>
@@ -5906,7 +6205,7 @@
                 <w:i w:val="0"/>
                 <w:sz w:val="17"/>
               </w:rPr>
-              <w:t>After the decisions above</w:t>
+              <w:t>After the decisions in section 5</w:t>
             </w:r>
           </w:p>
         </w:tc>
@@ -5939,7 +6238,7 @@
           <w:b w:val="0"/>
           <w:i w:val="0"/>
         </w:rPr>
-        <w:t xml:space="preserve"> mysql -uroot -e "CREATE DATABASE maiic_ifrs9_bootstrap" php artisan --env=bootstrap eir:bootstrap --fresh --force-wipe --with-client-inputs --build --run-engines --verify php artisan --env=bootstrap eir:as-at 2025-12-31 php artisan --env=bootstrap fli:method-cards php artisan test tests/Feature/Eir tests/Feature/Ebanker tests/Feature/FLI/TransmissionMethodCatalogueTest.php tests/Feature/NavigationTest.php </w:t>
+        <w:t xml:space="preserve"> mysql -uroot -e "CREATE DATABASE maiic_ifrs9_bootstrap" php artisan --env=bootstrap eir:bootstrap --fresh --force-wipe --with-client-inputs --build --run-engines --verify php artisan --env=bootstrap eir:as-at 2025-12-31 php artisan --env=bootstrap fli:method-cards php artisan --env=bootstrap fli:correlate 2026-08 php artisan --env=bootstrap scenario:sets 2026-08 python tools/compliance/build_audit.py --all --env=bootstrap php artisan test tests/Feature/Eir tests/Feature/Ebanker tests/Feature/FLI/TransmissionMethodCatalogueTest.php tests/Feature/NavigationTest.php </w:t>
       </w:r>
       <w:r>
         <w:rPr>
@@ -5985,7 +6284,7 @@
           <w:b w:val="0"/>
           <w:i w:val="0"/>
         </w:rPr>
-        <w:t xml:space="preserve">. The test run above: 280 passed, 24 skipped. The 92 legacy medical tests and the five legacy FLI page tests fail on </w:t>
+        <w:t xml:space="preserve">. The test run above: 301 passed, 24 skipped. The 92 legacy medical tests and the five legacy FLI page tests fail on </w:t>
       </w:r>
       <w:r>
         <w:rPr>

</xml_diff>

<commit_message>
The chain in its final order from one command; the reports in their own process; the after-build report for the third round
The bootstrap runs the scenario set, the sweep and the route before the
ECL, so the ECL is on the post-FLI PD, and renders the thirty reports in
a separate process, since dompdf after the whole chain exhausted the
first one's memory. From a wiped database: 125 seconds, nine golden
checks, 308 tests. The report's sections 2, 3 and 6 record the third
round; what remains is MAIIC's to decide or supply, or a third party's.

Co-Authored-By: Claude Fable 5.1 <noreply@anthropic.com>
</commit_message>
<xml_diff>
--- a/docs/MAIIC_After_Build_Report_2026-10-08.docx
+++ b/docs/MAIIC_After_Build_Report_2026-10-08.docx
@@ -102,14 +102,14 @@
           <w:i w:val="0"/>
           <w:sz w:val="18"/>
         </w:rPr>
-        <w:t>09ac5da</w:t>
+        <w:t>a86e88b</w:t>
       </w:r>
       <w:r>
         <w:rPr>
           <w:b w:val="0"/>
           <w:i w:val="0"/>
         </w:rPr>
-        <w:t>). This report says what was built, what the system proved when it ran, what the build found in the data and in the system that the specification did not know, and what is still owed. It is the comparison the specification asked for in its own section 8 (the build plan): the original specification stands as written; this report is read beside it.</w:t>
+        <w:t xml:space="preserve"> (three rounds on 8 and 9 October)). This report says what was built, what the system proved when it ran, what the build found in the data and in the system that the specification did not know, and what is still owed. It is the comparison the specification asked for in its own section 8 (the build plan): the original specification stands as written; this report is read beside it.</w:t>
       </w:r>
     </w:p>
     <w:p>
@@ -882,7 +882,7 @@
                 <w:i w:val="0"/>
                 <w:sz w:val="17"/>
               </w:rPr>
-              <w:t>Route 1 built (command and screen upload); routes 2 to 5 are the same door with a different carrier and are not yet wired</w:t>
+              <w:t>Routes 1 (manual), 2 (the polled folder, scheduled) and 3 (the API push) built through the one door; the SQLcl export template for route 2 committed; routes 4 and 5 await ICT and the vendor</w:t>
             </w:r>
           </w:p>
         </w:tc>
@@ -921,7 +921,32 @@
                 <w:i w:val="0"/>
                 <w:sz w:val="17"/>
               </w:rPr>
-              <w:t>EirFeedController::land</w:t>
+              <w:t>eir:poll-feed-folder</w:t>
+            </w:r>
+            <w:r>
+              <w:rPr>
+                <w:b w:val="0"/>
+                <w:i w:val="0"/>
+                <w:sz w:val="17"/>
+              </w:rPr>
+              <w:t xml:space="preserve">, the </w:t>
+            </w:r>
+            <w:r>
+              <w:rPr>
+                <w:rFonts w:ascii="Consolas" w:hAnsi="Consolas"/>
+                <w:b w:val="0"/>
+                <w:i w:val="0"/>
+                <w:sz w:val="17"/>
+              </w:rPr>
+              <w:t>ebanker-feed.api</w:t>
+            </w:r>
+            <w:r>
+              <w:rPr>
+                <w:b w:val="0"/>
+                <w:i w:val="0"/>
+                <w:sz w:val="17"/>
+              </w:rPr>
+              <w:t xml:space="preserve"> route</w:t>
             </w:r>
           </w:p>
         </w:tc>
@@ -1538,7 +1563,7 @@
                 <w:i w:val="0"/>
                 <w:sz w:val="17"/>
               </w:rPr>
-              <w:t>Steps 1 (macro), 2 (scenario set), 3 (staging), 4 (PD transition matrix), 5 (LGD cohort workout), 6 (forward-looking chain), 7 (ECL), 8 and 9 (EIR), 10 (reconciliation) run; 11 (stress) and 12 (reports and workbooks) remain the screens'</w:t>
+              <w:t>All twelve run from one command: macro, the scenario set, staging, PD, LGD, the forward-looking chain and route, the ECL on the post-FLI PD, the EIR and revenue, the reconciliation, stress testing for every scenario, every report, the compliance register; the Mega Farm step runs where the book holds the programme</w:t>
             </w:r>
           </w:p>
         </w:tc>
@@ -1568,6 +1593,23 @@
                 <w:i w:val="0"/>
                 <w:sz w:val="17"/>
               </w:rPr>
+              <w:t xml:space="preserve">; </w:t>
+            </w:r>
+            <w:r>
+              <w:rPr>
+                <w:rFonts w:ascii="Consolas" w:hAnsi="Consolas"/>
+                <w:b w:val="0"/>
+                <w:i w:val="0"/>
+                <w:sz w:val="17"/>
+              </w:rPr>
+              <w:t>PdEngineService</w:t>
+            </w:r>
+            <w:r>
+              <w:rPr>
+                <w:b w:val="0"/>
+                <w:i w:val="0"/>
+                <w:sz w:val="17"/>
+              </w:rPr>
               <w:t xml:space="preserve">, </w:t>
             </w:r>
             <w:r>
@@ -1577,7 +1619,7 @@
                 <w:i w:val="0"/>
                 <w:sz w:val="17"/>
               </w:rPr>
-              <w:t>PdEngineService</w:t>
+              <w:t>LgdEngineService</w:t>
             </w:r>
             <w:r>
               <w:rPr>
@@ -1594,7 +1636,41 @@
                 <w:i w:val="0"/>
                 <w:sz w:val="17"/>
               </w:rPr>
-              <w:t>LgdEngineService</w:t>
+              <w:t>FliRouteService</w:t>
+            </w:r>
+            <w:r>
+              <w:rPr>
+                <w:b w:val="0"/>
+                <w:i w:val="0"/>
+                <w:sz w:val="17"/>
+              </w:rPr>
+              <w:t xml:space="preserve">, </w:t>
+            </w:r>
+            <w:r>
+              <w:rPr>
+                <w:rFonts w:ascii="Consolas" w:hAnsi="Consolas"/>
+                <w:b w:val="0"/>
+                <w:i w:val="0"/>
+                <w:sz w:val="17"/>
+              </w:rPr>
+              <w:t>StressTestService</w:t>
+            </w:r>
+            <w:r>
+              <w:rPr>
+                <w:b w:val="0"/>
+                <w:i w:val="0"/>
+                <w:sz w:val="17"/>
+              </w:rPr>
+              <w:t xml:space="preserve">, </w:t>
+            </w:r>
+            <w:r>
+              <w:rPr>
+                <w:rFonts w:ascii="Consolas" w:hAnsi="Consolas"/>
+                <w:b w:val="0"/>
+                <w:i w:val="0"/>
+                <w:sz w:val="17"/>
+              </w:rPr>
+              <w:t>MegaFarmEclService</w:t>
             </w:r>
           </w:p>
         </w:tc>
@@ -2028,7 +2104,7 @@
                 <w:i w:val="0"/>
                 <w:sz w:val="17"/>
               </w:rPr>
-              <w:t>Six groups with accents, rail, top bar, page header with breadcrumb, light and dark</w:t>
+              <w:t>Six groups with accents, rail, top bar, page header with breadcrumb, light and dark; the help texts</w:t>
             </w:r>
           </w:p>
         </w:tc>
@@ -2049,7 +2125,7 @@
                 <w:i w:val="0"/>
                 <w:sz w:val="17"/>
               </w:rPr>
-              <w:t>Shell, shared styles and the tree built; the page-by-page dark sweep (11.9) remains</w:t>
+              <w:t>Shell, shared styles, the tree and the help centre (114 passages re-worded, a navigation article) built; the page-by-page dark sweep (11.9) remains</w:t>
             </w:r>
           </w:p>
         </w:tc>
@@ -2123,6 +2199,14 @@
                 <w:sz w:val="17"/>
               </w:rPr>
               <w:t>NavigationTest</w:t>
+            </w:r>
+            <w:r>
+              <w:rPr>
+                <w:b w:val="0"/>
+                <w:i w:val="0"/>
+                <w:sz w:val="17"/>
+              </w:rPr>
+              <w:t>, the help seeders</w:t>
             </w:r>
           </w:p>
         </w:tc>
@@ -2166,7 +2250,7 @@
                 <w:i w:val="0"/>
                 <w:sz w:val="17"/>
               </w:rPr>
-              <w:t>Codes on the series, World Bank fetcher, batches with provenance, the command with a snapshot</w:t>
+              <w:t>Codes, the World Bank fetcher, the IMF WEO parser, the RBM file, preview then commit, batches, the five-tab screen, the precedence rule</w:t>
             </w:r>
           </w:p>
         </w:tc>
@@ -2187,7 +2271,7 @@
                 <w:i w:val="0"/>
                 <w:sz w:val="17"/>
               </w:rPr>
-              <w:t>MS-1 to MS-3 built; the IMF WEO parser, the RBM file tab and the five-tab screen remain</w:t>
+              <w:t>Yes</w:t>
             </w:r>
           </w:p>
         </w:tc>
@@ -2209,7 +2293,7 @@
                 <w:i w:val="0"/>
                 <w:sz w:val="17"/>
               </w:rPr>
-              <w:t>MacroSeriesSeeder</w:t>
+              <w:t>app/Services/Macro/*</w:t>
             </w:r>
             <w:r>
               <w:rPr>
@@ -2226,7 +2310,7 @@
                 <w:i w:val="0"/>
                 <w:sz w:val="17"/>
               </w:rPr>
-              <w:t>WorldBankFetcherService</w:t>
+              <w:t>MacroStatisticsController</w:t>
             </w:r>
             <w:r>
               <w:rPr>
@@ -2243,24 +2327,7 @@
                 <w:i w:val="0"/>
                 <w:sz w:val="17"/>
               </w:rPr>
-              <w:t>MacroImportService</w:t>
-            </w:r>
-            <w:r>
-              <w:rPr>
-                <w:b w:val="0"/>
-                <w:i w:val="0"/>
-                <w:sz w:val="17"/>
-              </w:rPr>
-              <w:t xml:space="preserve">, </w:t>
-            </w:r>
-            <w:r>
-              <w:rPr>
-                <w:rFonts w:ascii="Consolas" w:hAnsi="Consolas"/>
-                <w:b w:val="0"/>
-                <w:i w:val="0"/>
-                <w:sz w:val="17"/>
-              </w:rPr>
-              <w:t>macro:import-worldbank</w:t>
+              <w:t>Pages/Macro/Index.vue</w:t>
             </w:r>
           </w:p>
         </w:tc>
@@ -2395,7 +2462,7 @@
                 <w:i w:val="0"/>
                 <w:sz w:val="17"/>
               </w:rPr>
-              <w:t>14.3 to 14.6 Forward-looking chain</w:t>
+              <w:t>14.3 to 14.8 Forward-looking chain and route</w:t>
             </w:r>
           </w:p>
         </w:tc>
@@ -2416,7 +2483,7 @@
                 <w:i w:val="0"/>
                 <w:sz w:val="17"/>
               </w:rPr>
-              <w:t>Guardrail, structural events, proxy deriver, profiler, correlation finder, regression</w:t>
+              <w:t>Guardrail, structural events, proxy deriver, profiler, correlation finder, regression; a fit approved under maker-checker; the route once per scenario; the lineage on every loan; the FLI Adjustments screen</w:t>
             </w:r>
           </w:p>
         </w:tc>
@@ -2437,16 +2504,7 @@
                 <w:i w:val="0"/>
                 <w:sz w:val="17"/>
               </w:rPr>
-              <w:t xml:space="preserve">Yes: the suite's engines ported as they are over a bridge from MAIIC's tables; </w:t>
-            </w:r>
-            <w:r>
-              <w:rPr>
-                <w:rFonts w:ascii="Consolas" w:hAnsi="Consolas"/>
-                <w:b w:val="0"/>
-                <w:i w:val="0"/>
-                <w:sz w:val="17"/>
-              </w:rPr>
-              <w:t>fli:correlate</w:t>
+              <w:t>Yes</w:t>
             </w:r>
           </w:p>
         </w:tc>
@@ -2485,6 +2543,23 @@
                 <w:i w:val="0"/>
                 <w:sz w:val="17"/>
               </w:rPr>
+              <w:t>FliRouteService</w:t>
+            </w:r>
+            <w:r>
+              <w:rPr>
+                <w:b w:val="0"/>
+                <w:i w:val="0"/>
+                <w:sz w:val="17"/>
+              </w:rPr>
+              <w:t xml:space="preserve">, </w:t>
+            </w:r>
+            <w:r>
+              <w:rPr>
+                <w:rFonts w:ascii="Consolas" w:hAnsi="Consolas"/>
+                <w:b w:val="0"/>
+                <w:i w:val="0"/>
+                <w:sz w:val="17"/>
+              </w:rPr>
               <w:t>app/Services/Fli/*</w:t>
             </w:r>
             <w:r>
@@ -2493,7 +2568,24 @@
                 <w:i w:val="0"/>
                 <w:sz w:val="17"/>
               </w:rPr>
-              <w:t>, 1 test</w:t>
+              <w:t xml:space="preserve">, </w:t>
+            </w:r>
+            <w:r>
+              <w:rPr>
+                <w:rFonts w:ascii="Consolas" w:hAnsi="Consolas"/>
+                <w:b w:val="0"/>
+                <w:i w:val="0"/>
+                <w:sz w:val="17"/>
+              </w:rPr>
+              <w:t>Pages/Fli/Adjustments.vue</w:t>
+            </w:r>
+            <w:r>
+              <w:rPr>
+                <w:b w:val="0"/>
+                <w:i w:val="0"/>
+                <w:sz w:val="17"/>
+              </w:rPr>
+              <w:t>, 4 tests</w:t>
             </w:r>
           </w:p>
         </w:tc>
@@ -2649,7 +2741,7 @@
                 <w:i w:val="0"/>
                 <w:sz w:val="17"/>
               </w:rPr>
-              <w:t>The engine with the two columns and the Baselines sheet; the five modules</w:t>
+              <w:t>The engine, the five modules, the register, the trace, the pack</w:t>
             </w:r>
           </w:p>
         </w:tc>
@@ -2670,7 +2762,7 @@
                 <w:i w:val="0"/>
                 <w:sz w:val="17"/>
               </w:rPr>
-              <w:t>Engine ported (CA-1); IFRS 9 EIR and impairment modules drafted and built in three formats (CA-2, part of CA-4); the register, trace and pack (CA-3) and three modules remain</w:t>
+              <w:t>Yes: five workbooks (66 sections) in three formats with the Baselines sheet; the register with maker-checker sign-off; the per-contract trace; the auditor's pack with checksums</w:t>
             </w:r>
           </w:p>
         </w:tc>
@@ -2710,6 +2802,57 @@
                 <w:sz w:val="17"/>
               </w:rPr>
               <w:t>docs/compliance/</w:t>
+            </w:r>
+            <w:r>
+              <w:rPr>
+                <w:b w:val="0"/>
+                <w:i w:val="0"/>
+                <w:sz w:val="17"/>
+              </w:rPr>
+              <w:t xml:space="preserve">, </w:t>
+            </w:r>
+            <w:r>
+              <w:rPr>
+                <w:rFonts w:ascii="Consolas" w:hAnsi="Consolas"/>
+                <w:b w:val="0"/>
+                <w:i w:val="0"/>
+                <w:sz w:val="17"/>
+              </w:rPr>
+              <w:t>ComplianceAuditService</w:t>
+            </w:r>
+            <w:r>
+              <w:rPr>
+                <w:b w:val="0"/>
+                <w:i w:val="0"/>
+                <w:sz w:val="17"/>
+              </w:rPr>
+              <w:t xml:space="preserve">, </w:t>
+            </w:r>
+            <w:r>
+              <w:rPr>
+                <w:rFonts w:ascii="Consolas" w:hAnsi="Consolas"/>
+                <w:b w:val="0"/>
+                <w:i w:val="0"/>
+                <w:sz w:val="17"/>
+              </w:rPr>
+              <w:t>AuditTraceController</w:t>
+            </w:r>
+            <w:r>
+              <w:rPr>
+                <w:b w:val="0"/>
+                <w:i w:val="0"/>
+                <w:sz w:val="17"/>
+              </w:rPr>
+              <w:t xml:space="preserve">, </w:t>
+            </w:r>
+            <w:r>
+              <w:rPr>
+                <w:rFonts w:ascii="Consolas" w:hAnsi="Consolas"/>
+                <w:b w:val="0"/>
+                <w:i w:val="0"/>
+                <w:sz w:val="17"/>
+              </w:rPr>
+              <w:t>compliance:audits --pack</w:t>
             </w:r>
           </w:p>
         </w:tc>
@@ -2753,7 +2896,7 @@
                 <w:i w:val="0"/>
                 <w:sz w:val="17"/>
               </w:rPr>
-              <w:t>The programme in the ECL module under D30</w:t>
+              <w:t>The programme in the ECL module under D30 with the governed PD methods</w:t>
             </w:r>
           </w:p>
         </w:tc>
@@ -2774,7 +2917,7 @@
                 <w:i w:val="0"/>
                 <w:sz w:val="17"/>
               </w:rPr>
-              <w:t>Not started; the November 2025 book found (section 4)</w:t>
+              <w:t>Mechanics built and run on the November 2025 book; the figure awaits Dr Thom's confirmation of D30 and the monthly books</w:t>
             </w:r>
           </w:p>
         </w:tc>
@@ -2791,11 +2934,29 @@
             </w:r>
             <w:r>
               <w:rPr>
+                <w:rFonts w:ascii="Consolas" w:hAnsi="Consolas"/>
                 <w:b w:val="0"/>
                 <w:i w:val="0"/>
                 <w:sz w:val="17"/>
               </w:rPr>
-              <w:t>section 6</w:t>
+              <w:t>MegaFarmEclService</w:t>
+            </w:r>
+            <w:r>
+              <w:rPr>
+                <w:b w:val="0"/>
+                <w:i w:val="0"/>
+                <w:sz w:val="17"/>
+              </w:rPr>
+              <w:t xml:space="preserve">, </w:t>
+            </w:r>
+            <w:r>
+              <w:rPr>
+                <w:rFonts w:ascii="Consolas" w:hAnsi="Consolas"/>
+                <w:b w:val="0"/>
+                <w:i w:val="0"/>
+                <w:sz w:val="17"/>
+              </w:rPr>
+              <w:t>megafarm:ecl</w:t>
             </w:r>
           </w:p>
         </w:tc>
@@ -2819,7 +2980,7 @@
           <w:b w:val="0"/>
           <w:i w:val="0"/>
         </w:rPr>
-        <w:t>The bootstrap on the wiped database, 8 October 2026 evening, then the engine chain as completed in the second round (about 90 seconds in all):</w:t>
+        <w:t>The bootstrap on the wiped database, 8 and 9 October 2026, with the engine chain as completed over the three rounds (about 125 seconds in all):</w:t>
       </w:r>
     </w:p>
     <w:tbl>
@@ -3494,6 +3655,138 @@
                 <w:sz w:val="17"/>
               </w:rPr>
               <w:t>The first set of 15.8 approved under the bootstrap label; sensitivity on 135 loans: base 9.63bn, upside 9.00bn, downside 11.10bn, severe 12.99bn, weighted 10.24bn</w:t>
+            </w:r>
+          </w:p>
+        </w:tc>
+      </w:tr>
+      <w:tr>
+        <w:tc>
+          <w:tcPr>
+            <w:tcW w:type="dxa" w:w="4986"/>
+          </w:tcPr>
+          <w:p>
+            <w:r>
+              <w:rPr>
+                <w:b w:val="0"/>
+                <w:sz w:val="17"/>
+              </w:rPr>
+            </w:r>
+            <w:r>
+              <w:rPr>
+                <w:b w:val="0"/>
+                <w:i w:val="0"/>
+                <w:sz w:val="17"/>
+              </w:rPr>
+              <w:t>Forward-looking route</w:t>
+            </w:r>
+          </w:p>
+        </w:tc>
+        <w:tc>
+          <w:tcPr>
+            <w:tcW w:type="dxa" w:w="4986"/>
+          </w:tcPr>
+          <w:p>
+            <w:r>
+              <w:rPr>
+                <w:b w:val="0"/>
+                <w:sz w:val="17"/>
+              </w:rPr>
+            </w:r>
+            <w:r>
+              <w:rPr>
+                <w:b w:val="0"/>
+                <w:i w:val="0"/>
+                <w:sz w:val="17"/>
+              </w:rPr>
+              <w:t>The best applied fit on a book-level proxy (the PLR to the Stage 3 share, lag 9) approved under the label; adjustments of -8.7% upside, +21.8% downside, +34.9% severe; the ECL on the post-FLI PD 8.94bn</w:t>
+            </w:r>
+          </w:p>
+        </w:tc>
+      </w:tr>
+      <w:tr>
+        <w:tc>
+          <w:tcPr>
+            <w:tcW w:type="dxa" w:w="4986"/>
+          </w:tcPr>
+          <w:p>
+            <w:r>
+              <w:rPr>
+                <w:b w:val="0"/>
+                <w:sz w:val="17"/>
+              </w:rPr>
+            </w:r>
+            <w:r>
+              <w:rPr>
+                <w:b w:val="0"/>
+                <w:i w:val="0"/>
+                <w:sz w:val="17"/>
+              </w:rPr>
+              <w:t>Stress testing</w:t>
+            </w:r>
+          </w:p>
+        </w:tc>
+        <w:tc>
+          <w:tcPr>
+            <w:tcW w:type="dxa" w:w="4986"/>
+          </w:tcPr>
+          <w:p>
+            <w:r>
+              <w:rPr>
+                <w:b w:val="0"/>
+                <w:sz w:val="17"/>
+              </w:rPr>
+            </w:r>
+            <w:r>
+              <w:rPr>
+                <w:b w:val="0"/>
+                <w:i w:val="0"/>
+                <w:sz w:val="17"/>
+              </w:rPr>
+              <w:t>The set's scenarios as saved runs: base 8.94bn, upside 8.31bn (-7.1%), downside 10.22bn (+14.3%), severe 11.86bn (+32.7%)</w:t>
+            </w:r>
+          </w:p>
+        </w:tc>
+      </w:tr>
+      <w:tr>
+        <w:tc>
+          <w:tcPr>
+            <w:tcW w:type="dxa" w:w="4986"/>
+          </w:tcPr>
+          <w:p>
+            <w:r>
+              <w:rPr>
+                <w:b w:val="0"/>
+                <w:sz w:val="17"/>
+              </w:rPr>
+            </w:r>
+            <w:r>
+              <w:rPr>
+                <w:b w:val="0"/>
+                <w:i w:val="0"/>
+                <w:sz w:val="17"/>
+              </w:rPr>
+              <w:t>Reports and the register</w:t>
+            </w:r>
+          </w:p>
+        </w:tc>
+        <w:tc>
+          <w:tcPr>
+            <w:tcW w:type="dxa" w:w="4986"/>
+          </w:tcPr>
+          <w:p>
+            <w:r>
+              <w:rPr>
+                <w:b w:val="0"/>
+                <w:sz w:val="17"/>
+              </w:rPr>
+            </w:r>
+            <w:r>
+              <w:rPr>
+                <w:b w:val="0"/>
+                <w:i w:val="0"/>
+                <w:sz w:val="17"/>
+              </w:rPr>
+              <w:t>Every one of the thirty reports rendered (in its own process); the five compliance workbooks loaded into the register</w:t>
             </w:r>
           </w:p>
         </w:tc>
@@ -5240,6 +5533,18 @@
         <w:t>6. What is still owed</w:t>
       </w:r>
     </w:p>
+    <w:p>
+      <w:pPr>
+        <w:spacing w:after="120"/>
+      </w:pPr>
+      <w:r>
+        <w:rPr>
+          <w:b w:val="0"/>
+          <w:i w:val="0"/>
+        </w:rPr>
+        <w:t>Everything the specification asked for that can be built without MAIIC's input is built. What remains is either MAIIC's to decide or supply, or needs a third party:</w:t>
+      </w:r>
+    </w:p>
     <w:tbl>
       <w:tblPr>
         <w:tblStyle w:val="TableGrid"/>
@@ -5247,15 +5552,14 @@
         <w:tblLook w:firstColumn="1" w:firstRow="1" w:lastColumn="0" w:lastRow="0" w:noHBand="0" w:noVBand="1" w:val="04A0"/>
       </w:tblPr>
       <w:tblGrid>
-        <w:gridCol w:w="2493"/>
-        <w:gridCol w:w="2493"/>
-        <w:gridCol w:w="2493"/>
-        <w:gridCol w:w="2493"/>
+        <w:gridCol w:w="3324"/>
+        <w:gridCol w:w="3324"/>
+        <w:gridCol w:w="3324"/>
       </w:tblGrid>
       <w:tr>
         <w:tc>
           <w:tcPr>
-            <w:tcW w:type="dxa" w:w="2493"/>
+            <w:tcW w:type="dxa" w:w="3324"/>
             <w:shd w:val="clear" w:color="auto" w:fill="1B2A41"/>
           </w:tcPr>
           <w:p>
@@ -5279,7 +5583,7 @@
         </w:tc>
         <w:tc>
           <w:tcPr>
-            <w:tcW w:type="dxa" w:w="2493"/>
+            <w:tcW w:type="dxa" w:w="3324"/>
             <w:shd w:val="clear" w:color="auto" w:fill="1B2A41"/>
           </w:tcPr>
           <w:p>
@@ -5303,7 +5607,7 @@
         </w:tc>
         <w:tc>
           <w:tcPr>
-            <w:tcW w:type="dxa" w:w="2493"/>
+            <w:tcW w:type="dxa" w:w="3324"/>
             <w:shd w:val="clear" w:color="auto" w:fill="1B2A41"/>
           </w:tcPr>
           <w:p>
@@ -5321,31 +5625,7 @@
                 <w:color w:val="FFFFFF"/>
                 <w:sz w:val="17"/>
               </w:rPr>
-              <w:t>What it is</w:t>
-            </w:r>
-          </w:p>
-        </w:tc>
-        <w:tc>
-          <w:tcPr>
-            <w:tcW w:type="dxa" w:w="2493"/>
-            <w:shd w:val="clear" w:color="auto" w:fill="1B2A41"/>
-          </w:tcPr>
-          <w:p>
-            <w:r>
-              <w:rPr>
-                <w:b/>
-                <w:color w:val="FFFFFF"/>
-                <w:sz w:val="17"/>
-              </w:rPr>
-            </w:r>
-            <w:r>
-              <w:rPr>
-                <w:b/>
-                <w:i w:val="0"/>
-                <w:color w:val="FFFFFF"/>
-                <w:sz w:val="17"/>
-              </w:rPr>
-              <w:t>Size</w:t>
+              <w:t>What it needs</w:t>
             </w:r>
           </w:p>
         </w:tc>
@@ -5353,7 +5633,7 @@
       <w:tr>
         <w:tc>
           <w:tcPr>
-            <w:tcW w:type="dxa" w:w="2493"/>
+            <w:tcW w:type="dxa" w:w="3324"/>
           </w:tcPr>
           <w:p>
             <w:r>
@@ -5368,13 +5648,13 @@
                 <w:i w:val="0"/>
                 <w:sz w:val="17"/>
               </w:rPr>
-              <w:t>Routes 2 to 5 of the feed</w:t>
+              <w:t>Routes 4 and 5 of the feed</w:t>
             </w:r>
           </w:p>
         </w:tc>
         <w:tc>
           <w:tcPr>
-            <w:tcW w:type="dxa" w:w="2493"/>
+            <w:tcW w:type="dxa" w:w="3324"/>
           </w:tcPr>
           <w:p>
             <w:r>
@@ -5395,7 +5675,7 @@
         </w:tc>
         <w:tc>
           <w:tcPr>
-            <w:tcW w:type="dxa" w:w="2493"/>
+            <w:tcW w:type="dxa" w:w="3324"/>
           </w:tcPr>
           <w:p>
             <w:r>
@@ -5410,28 +5690,7 @@
                 <w:i w:val="0"/>
                 <w:sz w:val="17"/>
               </w:rPr>
-              <w:t>The scheduled export, the API push, the direct read, the vendor view: the same pack through the same door</w:t>
-            </w:r>
-          </w:p>
-        </w:tc>
-        <w:tc>
-          <w:tcPr>
-            <w:tcW w:type="dxa" w:w="2493"/>
-          </w:tcPr>
-          <w:p>
-            <w:r>
-              <w:rPr>
-                <w:b w:val="0"/>
-                <w:sz w:val="17"/>
-              </w:rPr>
-            </w:r>
-            <w:r>
-              <w:rPr>
-                <w:b w:val="0"/>
-                <w:i w:val="0"/>
-                <w:sz w:val="17"/>
-              </w:rPr>
-              <w:t>Route 2: a script and a scheduler job; route 4 needs ICT's consent</w:t>
+              <w:t>ICT's consent to a read-only Oracle account over the VPN (route 4); a paid change request to the vendor (route 5)</w:t>
             </w:r>
           </w:p>
         </w:tc>
@@ -5439,7 +5698,7 @@
       <w:tr>
         <w:tc>
           <w:tcPr>
-            <w:tcW w:type="dxa" w:w="2493"/>
+            <w:tcW w:type="dxa" w:w="3324"/>
           </w:tcPr>
           <w:p>
             <w:r>
@@ -5454,13 +5713,13 @@
                 <w:i w:val="0"/>
                 <w:sz w:val="17"/>
               </w:rPr>
-              <w:t>Stress testing and the reports in the chain</w:t>
+              <w:t>The golden numbers for the ECL at the year-ends and the revenue shift</w:t>
             </w:r>
           </w:p>
         </w:tc>
         <w:tc>
           <w:tcPr>
-            <w:tcW w:type="dxa" w:w="2493"/>
+            <w:tcW w:type="dxa" w:w="3324"/>
           </w:tcPr>
           <w:p>
             <w:r>
@@ -5475,13 +5734,13 @@
                 <w:i w:val="0"/>
                 <w:sz w:val="17"/>
               </w:rPr>
-              <w:t>6.10.1 steps 11, 12</w:t>
+              <w:t>6.10.2</w:t>
             </w:r>
           </w:p>
         </w:tc>
         <w:tc>
           <w:tcPr>
-            <w:tcW w:type="dxa" w:w="2493"/>
+            <w:tcW w:type="dxa" w:w="3324"/>
           </w:tcPr>
           <w:p>
             <w:r>
@@ -5496,28 +5755,7 @@
                 <w:i w:val="0"/>
                 <w:sz w:val="17"/>
               </w:rPr>
-              <w:t>Run from their screens today</w:t>
-            </w:r>
-          </w:p>
-        </w:tc>
-        <w:tc>
-          <w:tcPr>
-            <w:tcW w:type="dxa" w:w="2493"/>
-          </w:tcPr>
-          <w:p>
-            <w:r>
-              <w:rPr>
-                <w:b w:val="0"/>
-                <w:sz w:val="17"/>
-              </w:rPr>
-            </w:r>
-            <w:r>
-              <w:rPr>
-                <w:b w:val="0"/>
-                <w:i w:val="0"/>
-                <w:sz w:val="17"/>
-              </w:rPr>
-              <w:t>Half a day each</w:t>
+              <w:t>The first run Dr Thom approves: the fee rulebook, the matrix and LGD key-locks, the fit and the set</w:t>
             </w:r>
           </w:p>
         </w:tc>
@@ -5525,7 +5763,7 @@
       <w:tr>
         <w:tc>
           <w:tcPr>
-            <w:tcW w:type="dxa" w:w="2493"/>
+            <w:tcW w:type="dxa" w:w="3324"/>
           </w:tcPr>
           <w:p>
             <w:r>
@@ -5540,13 +5778,13 @@
                 <w:i w:val="0"/>
                 <w:sz w:val="17"/>
               </w:rPr>
-              <w:t>FLI Adjustments screen and the fit approval</w:t>
+              <w:t>The Mega Farm figure</w:t>
             </w:r>
           </w:p>
         </w:tc>
         <w:tc>
           <w:tcPr>
-            <w:tcW w:type="dxa" w:w="2493"/>
+            <w:tcW w:type="dxa" w:w="3324"/>
           </w:tcPr>
           <w:p>
             <w:r>
@@ -5561,13 +5799,13 @@
                 <w:i w:val="0"/>
                 <w:sz w:val="17"/>
               </w:rPr>
-              <w:t>14.6</w:t>
+              <w:t>16</w:t>
             </w:r>
           </w:p>
         </w:tc>
         <w:tc>
           <w:tcPr>
-            <w:tcW w:type="dxa" w:w="2493"/>
+            <w:tcW w:type="dxa" w:w="3324"/>
           </w:tcPr>
           <w:p>
             <w:r>
@@ -5582,28 +5820,7 @@
                 <w:i w:val="0"/>
                 <w:sz w:val="17"/>
               </w:rPr>
-              <w:t>The chain's applied fits are proposals; a reviewer approves one on a screen and the route applies it per scenario</w:t>
-            </w:r>
-          </w:p>
-        </w:tc>
-        <w:tc>
-          <w:tcPr>
-            <w:tcW w:type="dxa" w:w="2493"/>
-          </w:tcPr>
-          <w:p>
-            <w:r>
-              <w:rPr>
-                <w:b w:val="0"/>
-                <w:sz w:val="17"/>
-              </w:rPr>
-            </w:r>
-            <w:r>
-              <w:rPr>
-                <w:b w:val="0"/>
-                <w:i w:val="0"/>
-                <w:sz w:val="17"/>
-              </w:rPr>
-              <w:t>One day</w:t>
+              <w:t>Dr Thom's confirmation of D30 and the monthly Mega Farm books (MF_01 to MF_08 from Barry); the mechanics run today on the November 2025 book</w:t>
             </w:r>
           </w:p>
         </w:tc>
@@ -5611,7 +5828,7 @@
       <w:tr>
         <w:tc>
           <w:tcPr>
-            <w:tcW w:type="dxa" w:w="2493"/>
+            <w:tcW w:type="dxa" w:w="3324"/>
           </w:tcPr>
           <w:p>
             <w:r>
@@ -5626,13 +5843,13 @@
                 <w:i w:val="0"/>
                 <w:sz w:val="17"/>
               </w:rPr>
-              <w:t>The chain per scenario</w:t>
+              <w:t>The restructure history and the 10 percent test</w:t>
             </w:r>
           </w:p>
         </w:tc>
         <w:tc>
           <w:tcPr>
-            <w:tcW w:type="dxa" w:w="2493"/>
+            <w:tcW w:type="dxa" w:w="3324"/>
           </w:tcPr>
           <w:p>
             <w:r>
@@ -5647,13 +5864,13 @@
                 <w:i w:val="0"/>
                 <w:sz w:val="17"/>
               </w:rPr>
-              <w:t>15.5</w:t>
+              <w:t>5.4.3, 3.3.2</w:t>
             </w:r>
           </w:p>
         </w:tc>
         <w:tc>
           <w:tcPr>
-            <w:tcW w:type="dxa" w:w="2493"/>
+            <w:tcW w:type="dxa" w:w="3324"/>
           </w:tcPr>
           <w:p>
             <w:r>
@@ -5668,28 +5885,7 @@
                 <w:i w:val="0"/>
                 <w:sz w:val="17"/>
               </w:rPr>
-              <w:t>The sensitivity uses the scenario multipliers; the full method runs the fitted relationship under each scenario's shocked path</w:t>
-            </w:r>
-          </w:p>
-        </w:tc>
-        <w:tc>
-          <w:tcPr>
-            <w:tcW w:type="dxa" w:w="2493"/>
-          </w:tcPr>
-          <w:p>
-            <w:r>
-              <w:rPr>
-                <w:b w:val="0"/>
-                <w:sz w:val="17"/>
-              </w:rPr>
-            </w:r>
-            <w:r>
-              <w:rPr>
-                <w:b w:val="0"/>
-                <w:i w:val="0"/>
-                <w:sz w:val="17"/>
-              </w:rPr>
-              <w:t>One day after the fit approval</w:t>
+              <w:t>E-Banker's Reschedule Report from the vendor</w:t>
             </w:r>
           </w:p>
         </w:tc>
@@ -5697,7 +5893,7 @@
       <w:tr>
         <w:tc>
           <w:tcPr>
-            <w:tcW w:type="dxa" w:w="2493"/>
+            <w:tcW w:type="dxa" w:w="3324"/>
           </w:tcPr>
           <w:p>
             <w:r>
@@ -5712,13 +5908,13 @@
                 <w:i w:val="0"/>
                 <w:sz w:val="17"/>
               </w:rPr>
-              <w:t>Macro screen, IMF WEO, RBM file</w:t>
+              <w:t>Contract Schedule 1's clause numbers</w:t>
             </w:r>
           </w:p>
         </w:tc>
         <w:tc>
           <w:tcPr>
-            <w:tcW w:type="dxa" w:w="2493"/>
+            <w:tcW w:type="dxa" w:w="3324"/>
           </w:tcPr>
           <w:p>
             <w:r>
@@ -5733,13 +5929,13 @@
                 <w:i w:val="0"/>
                 <w:sz w:val="17"/>
               </w:rPr>
-              <w:t>13</w:t>
+              <w:t>12</w:t>
             </w:r>
           </w:p>
         </w:tc>
         <w:tc>
           <w:tcPr>
-            <w:tcW w:type="dxa" w:w="2493"/>
+            <w:tcW w:type="dxa" w:w="3324"/>
           </w:tcPr>
           <w:p>
             <w:r>
@@ -5754,28 +5950,7 @@
                 <w:i w:val="0"/>
                 <w:sz w:val="17"/>
               </w:rPr>
-              <w:t>The five-tab screen, the WEO parser (the forecast years), the policy-rate file tab</w:t>
-            </w:r>
-          </w:p>
-        </w:tc>
-        <w:tc>
-          <w:tcPr>
-            <w:tcW w:type="dxa" w:w="2493"/>
-          </w:tcPr>
-          <w:p>
-            <w:r>
-              <w:rPr>
-                <w:b w:val="0"/>
-                <w:sz w:val="17"/>
-              </w:rPr>
-            </w:r>
-            <w:r>
-              <w:rPr>
-                <w:b w:val="0"/>
-                <w:i w:val="0"/>
-                <w:sz w:val="17"/>
-              </w:rPr>
-              <w:t>One to two days</w:t>
+              <w:t>The signed schedule from Dr Thom</w:t>
             </w:r>
           </w:p>
         </w:tc>
@@ -5783,7 +5958,7 @@
       <w:tr>
         <w:tc>
           <w:tcPr>
-            <w:tcW w:type="dxa" w:w="2493"/>
+            <w:tcW w:type="dxa" w:w="3324"/>
           </w:tcPr>
           <w:p>
             <w:r>
@@ -5798,13 +5973,13 @@
                 <w:i w:val="0"/>
                 <w:sz w:val="17"/>
               </w:rPr>
-              <w:t>Audit workbooks: register, trace, pack; three modules</w:t>
+              <w:t>The dark-mode page sweep</w:t>
             </w:r>
           </w:p>
         </w:tc>
         <w:tc>
           <w:tcPr>
-            <w:tcW w:type="dxa" w:w="2493"/>
+            <w:tcW w:type="dxa" w:w="3324"/>
           </w:tcPr>
           <w:p>
             <w:r>
@@ -5819,13 +5994,13 @@
                 <w:i w:val="0"/>
                 <w:sz w:val="17"/>
               </w:rPr>
-              <w:t>12 (CA-3, rest of CA-4)</w:t>
+              <w:t>11.9</w:t>
             </w:r>
           </w:p>
         </w:tc>
         <w:tc>
           <w:tcPr>
-            <w:tcW w:type="dxa" w:w="2493"/>
+            <w:tcW w:type="dxa" w:w="3324"/>
           </w:tcPr>
           <w:p>
             <w:r>
@@ -5840,28 +6015,7 @@
                 <w:i w:val="0"/>
                 <w:sz w:val="17"/>
               </w:rPr>
-              <w:t>The register where MAIIC signs each row, the per-record trace, the auditor's pack; IFRS 7 / IAS 1, the RBM directive, Contract Schedule 1</w:t>
-            </w:r>
-          </w:p>
-        </w:tc>
-        <w:tc>
-          <w:tcPr>
-            <w:tcW w:type="dxa" w:w="2493"/>
-          </w:tcPr>
-          <w:p>
-            <w:r>
-              <w:rPr>
-                <w:b w:val="0"/>
-                <w:sz w:val="17"/>
-              </w:rPr>
-            </w:r>
-            <w:r>
-              <w:rPr>
-                <w:b w:val="0"/>
-                <w:i w:val="0"/>
-                <w:sz w:val="17"/>
-              </w:rPr>
-              <w:t>Two to three days</w:t>
+              <w:t>Ongoing: the shell and the shared classes carry the theme; pages that style elements directly are swept group by group as they are touched</w:t>
             </w:r>
           </w:p>
         </w:tc>
@@ -5869,7 +6023,7 @@
       <w:tr>
         <w:tc>
           <w:tcPr>
-            <w:tcW w:type="dxa" w:w="2493"/>
+            <w:tcW w:type="dxa" w:w="3324"/>
           </w:tcPr>
           <w:p>
             <w:r>
@@ -5884,13 +6038,13 @@
                 <w:i w:val="0"/>
                 <w:sz w:val="17"/>
               </w:rPr>
-              <w:t>Mega Farm module</w:t>
+              <w:t>The Mega Farm screen; the method cards beside the Governance Centre setting</w:t>
             </w:r>
           </w:p>
         </w:tc>
         <w:tc>
           <w:tcPr>
-            <w:tcW w:type="dxa" w:w="2493"/>
+            <w:tcW w:type="dxa" w:w="3324"/>
           </w:tcPr>
           <w:p>
             <w:r>
@@ -5905,13 +6059,13 @@
                 <w:i w:val="0"/>
                 <w:sz w:val="17"/>
               </w:rPr>
-              <w:t>16</w:t>
+              <w:t>16, 14.7</w:t>
             </w:r>
           </w:p>
         </w:tc>
         <w:tc>
           <w:tcPr>
-            <w:tcW w:type="dxa" w:w="2493"/>
+            <w:tcW w:type="dxa" w:w="3324"/>
           </w:tcPr>
           <w:p>
             <w:r>
@@ -5926,286 +6080,7 @@
                 <w:i w:val="0"/>
                 <w:sz w:val="17"/>
               </w:rPr>
-              <w:t>The programme in the ECL module under D30 with the three PD options</w:t>
-            </w:r>
-          </w:p>
-        </w:tc>
-        <w:tc>
-          <w:tcPr>
-            <w:tcW w:type="dxa" w:w="2493"/>
-          </w:tcPr>
-          <w:p>
-            <w:r>
-              <w:rPr>
-                <w:b w:val="0"/>
-                <w:sz w:val="17"/>
-              </w:rPr>
-            </w:r>
-            <w:r>
-              <w:rPr>
-                <w:b w:val="0"/>
-                <w:i w:val="0"/>
-                <w:sz w:val="17"/>
-              </w:rPr>
-              <w:t>After Dr Thom's confirmation and the monthly books</w:t>
-            </w:r>
-          </w:p>
-        </w:tc>
-      </w:tr>
-      <w:tr>
-        <w:tc>
-          <w:tcPr>
-            <w:tcW w:type="dxa" w:w="2493"/>
-          </w:tcPr>
-          <w:p>
-            <w:r>
-              <w:rPr>
-                <w:b w:val="0"/>
-                <w:sz w:val="17"/>
-              </w:rPr>
-            </w:r>
-            <w:r>
-              <w:rPr>
-                <w:b w:val="0"/>
-                <w:i w:val="0"/>
-                <w:sz w:val="17"/>
-              </w:rPr>
-              <w:t>Dark-mode sweep; help texts; the user manual's navigation chapter</w:t>
-            </w:r>
-          </w:p>
-        </w:tc>
-        <w:tc>
-          <w:tcPr>
-            <w:tcW w:type="dxa" w:w="2493"/>
-          </w:tcPr>
-          <w:p>
-            <w:r>
-              <w:rPr>
-                <w:b w:val="0"/>
-                <w:sz w:val="17"/>
-              </w:rPr>
-            </w:r>
-            <w:r>
-              <w:rPr>
-                <w:b w:val="0"/>
-                <w:i w:val="0"/>
-                <w:sz w:val="17"/>
-              </w:rPr>
-              <w:t>11.6, 11.9</w:t>
-            </w:r>
-          </w:p>
-        </w:tc>
-        <w:tc>
-          <w:tcPr>
-            <w:tcW w:type="dxa" w:w="2493"/>
-          </w:tcPr>
-          <w:p>
-            <w:r>
-              <w:rPr>
-                <w:b w:val="0"/>
-                <w:sz w:val="17"/>
-              </w:rPr>
-            </w:r>
-            <w:r>
-              <w:rPr>
-                <w:b w:val="0"/>
-                <w:i w:val="0"/>
-                <w:sz w:val="17"/>
-              </w:rPr>
-              <w:t>The pages that style elements directly; fifteen passages; screenshots</w:t>
-            </w:r>
-          </w:p>
-        </w:tc>
-        <w:tc>
-          <w:tcPr>
-            <w:tcW w:type="dxa" w:w="2493"/>
-          </w:tcPr>
-          <w:p>
-            <w:r>
-              <w:rPr>
-                <w:b w:val="0"/>
-                <w:sz w:val="17"/>
-              </w:rPr>
-            </w:r>
-            <w:r>
-              <w:rPr>
-                <w:b w:val="0"/>
-                <w:i w:val="0"/>
-                <w:sz w:val="17"/>
-              </w:rPr>
-              <w:t>Ongoing; half a day for the texts</w:t>
-            </w:r>
-          </w:p>
-        </w:tc>
-      </w:tr>
-      <w:tr>
-        <w:tc>
-          <w:tcPr>
-            <w:tcW w:type="dxa" w:w="2493"/>
-          </w:tcPr>
-          <w:p>
-            <w:r>
-              <w:rPr>
-                <w:b w:val="0"/>
-                <w:sz w:val="17"/>
-              </w:rPr>
-            </w:r>
-            <w:r>
-              <w:rPr>
-                <w:b w:val="0"/>
-                <w:i w:val="0"/>
-                <w:sz w:val="17"/>
-              </w:rPr>
-              <w:t>Tests for the PD and LGD services</w:t>
-            </w:r>
-          </w:p>
-        </w:tc>
-        <w:tc>
-          <w:tcPr>
-            <w:tcW w:type="dxa" w:w="2493"/>
-          </w:tcPr>
-          <w:p>
-            <w:r>
-              <w:rPr>
-                <w:b w:val="0"/>
-                <w:sz w:val="17"/>
-              </w:rPr>
-            </w:r>
-            <w:r>
-              <w:rPr>
-                <w:b w:val="0"/>
-                <w:i w:val="0"/>
-                <w:sz w:val="17"/>
-              </w:rPr>
-              <w:t>6.10.1</w:t>
-            </w:r>
-          </w:p>
-        </w:tc>
-        <w:tc>
-          <w:tcPr>
-            <w:tcW w:type="dxa" w:w="2493"/>
-          </w:tcPr>
-          <w:p>
-            <w:r>
-              <w:rPr>
-                <w:b w:val="0"/>
-                <w:sz w:val="17"/>
-              </w:rPr>
-            </w:r>
-            <w:r>
-              <w:rPr>
-                <w:b w:val="0"/>
-                <w:i w:val="0"/>
-                <w:sz w:val="17"/>
-              </w:rPr>
-              <w:t>The engines are proven by the bootstrap run; unit tests on a fixture are owed</w:t>
-            </w:r>
-          </w:p>
-        </w:tc>
-        <w:tc>
-          <w:tcPr>
-            <w:tcW w:type="dxa" w:w="2493"/>
-          </w:tcPr>
-          <w:p>
-            <w:r>
-              <w:rPr>
-                <w:b w:val="0"/>
-                <w:sz w:val="17"/>
-              </w:rPr>
-            </w:r>
-            <w:r>
-              <w:rPr>
-                <w:b w:val="0"/>
-                <w:i w:val="0"/>
-                <w:sz w:val="17"/>
-              </w:rPr>
-              <w:t>Half a day</w:t>
-            </w:r>
-          </w:p>
-        </w:tc>
-      </w:tr>
-      <w:tr>
-        <w:tc>
-          <w:tcPr>
-            <w:tcW w:type="dxa" w:w="2493"/>
-          </w:tcPr>
-          <w:p>
-            <w:r>
-              <w:rPr>
-                <w:b w:val="0"/>
-                <w:sz w:val="17"/>
-              </w:rPr>
-            </w:r>
-            <w:r>
-              <w:rPr>
-                <w:b w:val="0"/>
-                <w:i w:val="0"/>
-                <w:sz w:val="17"/>
-              </w:rPr>
-              <w:t>Golden numbers for the ECL and the revenue shift</w:t>
-            </w:r>
-          </w:p>
-        </w:tc>
-        <w:tc>
-          <w:tcPr>
-            <w:tcW w:type="dxa" w:w="2493"/>
-          </w:tcPr>
-          <w:p>
-            <w:r>
-              <w:rPr>
-                <w:b w:val="0"/>
-                <w:sz w:val="17"/>
-              </w:rPr>
-            </w:r>
-            <w:r>
-              <w:rPr>
-                <w:b w:val="0"/>
-                <w:i w:val="0"/>
-                <w:sz w:val="17"/>
-              </w:rPr>
-              <w:t>6.10.2</w:t>
-            </w:r>
-          </w:p>
-        </w:tc>
-        <w:tc>
-          <w:tcPr>
-            <w:tcW w:type="dxa" w:w="2493"/>
-          </w:tcPr>
-          <w:p>
-            <w:r>
-              <w:rPr>
-                <w:b w:val="0"/>
-                <w:sz w:val="17"/>
-              </w:rPr>
-            </w:r>
-            <w:r>
-              <w:rPr>
-                <w:b w:val="0"/>
-                <w:i w:val="0"/>
-                <w:sz w:val="17"/>
-              </w:rPr>
-              <w:t>Born on the first approved run</w:t>
-            </w:r>
-          </w:p>
-        </w:tc>
-        <w:tc>
-          <w:tcPr>
-            <w:tcW w:type="dxa" w:w="2493"/>
-          </w:tcPr>
-          <w:p>
-            <w:r>
-              <w:rPr>
-                <w:b w:val="0"/>
-                <w:sz w:val="17"/>
-              </w:rPr>
-            </w:r>
-            <w:r>
-              <w:rPr>
-                <w:b w:val="0"/>
-                <w:i w:val="0"/>
-                <w:sz w:val="17"/>
-              </w:rPr>
-              <w:t>After the decisions in section 5</w:t>
+              <w:t>Small screen work; the cards are on the FLI Adjustments screen and the JSON route</w:t>
             </w:r>
           </w:p>
         </w:tc>
@@ -6238,7 +6113,7 @@
           <w:b w:val="0"/>
           <w:i w:val="0"/>
         </w:rPr>
-        <w:t xml:space="preserve"> mysql -uroot -e "CREATE DATABASE maiic_ifrs9_bootstrap" php artisan --env=bootstrap eir:bootstrap --fresh --force-wipe --with-client-inputs --build --run-engines --verify php artisan --env=bootstrap eir:as-at 2025-12-31 php artisan --env=bootstrap fli:method-cards php artisan --env=bootstrap fli:correlate 2026-08 php artisan --env=bootstrap scenario:sets 2026-08 python tools/compliance/build_audit.py --all --env=bootstrap php artisan test tests/Feature/Eir tests/Feature/Ebanker tests/Feature/FLI/TransmissionMethodCatalogueTest.php tests/Feature/NavigationTest.php </w:t>
+        <w:t xml:space="preserve"> mysql -uroot -e "CREATE DATABASE maiic_ifrs9_bootstrap" php artisan --env=bootstrap eir:bootstrap --fresh --force-wipe --with-client-inputs --build --run-engines --verify php artisan --env=bootstrap eir:as-at 2025-12-31 php artisan --env=bootstrap fli:method-cards php artisan --env=bootstrap fli:correlate 2026-08 php artisan --env=bootstrap scenario:sets 2026-08 python tools/compliance/build_audit.py --all --env=bootstrap php artisan --env=bootstrap fli:apply 2026-08 --fits php artisan --env=bootstrap compliance:audits --pack=2026-08 php artisan --env=demo megafarm:ecl 2025-11 php artisan test tests/Feature/Eir tests/Feature/Ebanker tests/Feature/FLI/TransmissionMethodCatalogueTest.php tests/Feature/NavigationTest.php </w:t>
       </w:r>
       <w:r>
         <w:rPr>
@@ -6284,7 +6159,7 @@
           <w:b w:val="0"/>
           <w:i w:val="0"/>
         </w:rPr>
-        <w:t xml:space="preserve">. The test run above: 301 passed, 24 skipped. The 92 legacy medical tests and the five legacy FLI page tests fail on </w:t>
+        <w:t xml:space="preserve">. The test run above: 308 passed, 24 skipped. The 92 legacy medical tests and the five legacy FLI page tests fail on </w:t>
       </w:r>
       <w:r>
         <w:rPr>

</xml_diff>

<commit_message>
The Mega Farm screen; the method cards inline on the Governance Centre setting (spec v4 s.16, 14.7)
Financial Modelling / Mega Farm Programme: the programme's book by scheme
and by stage for a period, the governed scope, method and ceiling in
force with whether D30 is confirmed, each run with its basis or the
reason it was declined, and the Run action for the governed role. The
Governance Centre shows, on every option of fli_transmission_method, a
badge saying whether the method can be selected and the method card on
request: what it does, the formula, what it implies, its preconditions
checked live against the data, a worked example. The after-build report,
the impairment workbook, the register and the help centre are updated.

Co-Authored-By: Claude Fable 5.1 <noreply@anthropic.com>
</commit_message>
<xml_diff>
--- a/docs/MAIIC_After_Build_Report_2026-10-08.docx
+++ b/docs/MAIIC_After_Build_Report_2026-10-08.docx
@@ -93,23 +93,7 @@
           <w:b w:val="0"/>
           <w:i w:val="0"/>
         </w:rPr>
-        <w:t xml:space="preserve"> to </w:t>
-      </w:r>
-      <w:r>
-        <w:rPr>
-          <w:rFonts w:ascii="Consolas" w:hAnsi="Consolas"/>
-          <w:b w:val="0"/>
-          <w:i w:val="0"/>
-          <w:sz w:val="18"/>
-        </w:rPr>
-        <w:t>a86e88b</w:t>
-      </w:r>
-      <w:r>
-        <w:rPr>
-          <w:b w:val="0"/>
-          <w:i w:val="0"/>
-        </w:rPr>
-        <w:t xml:space="preserve"> (three rounds on 8 and 9 October)). This report says what was built, what the system proved when it ran, what the build found in the data and in the system that the specification did not know, and what is still owed. It is the comparison the specification asked for in its own section 8 (the build plan): the original specification stands as written; this report is read beside it.</w:t>
+        <w:t xml:space="preserve"> to the head of 9 October (three rounds on 8 and 9 October)). This report says what was built, what the system proved when it ran, what the build found in the data and in the system that the specification did not know, and what is still owed. It is the comparison the specification asked for in its own section 8 (the build plan): the original specification stands as written; this report is read beside it.</w:t>
       </w:r>
     </w:p>
     <w:p>
@@ -2371,7 +2355,7 @@
                 <w:i w:val="0"/>
                 <w:sz w:val="17"/>
               </w:rPr>
-              <w:t>Governed methods, each explained with live preconditions and a worked example</w:t>
+              <w:t>Governed methods, each explained with live preconditions and a worked example, in the screen and beside the setting</w:t>
             </w:r>
           </w:p>
         </w:tc>
@@ -2392,7 +2376,24 @@
                 <w:i w:val="0"/>
                 <w:sz w:val="17"/>
               </w:rPr>
-              <w:t>Yes</w:t>
+              <w:t xml:space="preserve">Yes: the cards are on the FLI Adjustments screen and inline on the </w:t>
+            </w:r>
+            <w:r>
+              <w:rPr>
+                <w:rFonts w:ascii="Consolas" w:hAnsi="Consolas"/>
+                <w:b w:val="0"/>
+                <w:i w:val="0"/>
+                <w:sz w:val="17"/>
+              </w:rPr>
+              <w:t>fli_transmission_method</w:t>
+            </w:r>
+            <w:r>
+              <w:rPr>
+                <w:b w:val="0"/>
+                <w:i w:val="0"/>
+                <w:sz w:val="17"/>
+              </w:rPr>
+              <w:t xml:space="preserve"> setting in the Governance Centre, with a badge saying whether each method can be selected</w:t>
             </w:r>
           </w:p>
         </w:tc>
@@ -2432,6 +2433,23 @@
                 <w:sz w:val="17"/>
               </w:rPr>
               <w:t>fli:method-cards</w:t>
+            </w:r>
+            <w:r>
+              <w:rPr>
+                <w:b w:val="0"/>
+                <w:i w:val="0"/>
+                <w:sz w:val="17"/>
+              </w:rPr>
+              <w:t xml:space="preserve">, </w:t>
+            </w:r>
+            <w:r>
+              <w:rPr>
+                <w:rFonts w:ascii="Consolas" w:hAnsi="Consolas"/>
+                <w:b w:val="0"/>
+                <w:i w:val="0"/>
+                <w:sz w:val="17"/>
+              </w:rPr>
+              <w:t>Pages/Eir/Governance.vue</w:t>
             </w:r>
             <w:r>
               <w:rPr>
@@ -2896,7 +2914,7 @@
                 <w:i w:val="0"/>
                 <w:sz w:val="17"/>
               </w:rPr>
-              <w:t>The programme in the ECL module under D30 with the governed PD methods</w:t>
+              <w:t>The programme in the ECL module under D30 with the governed PD methods; its screen</w:t>
             </w:r>
           </w:p>
         </w:tc>
@@ -2917,7 +2935,7 @@
                 <w:i w:val="0"/>
                 <w:sz w:val="17"/>
               </w:rPr>
-              <w:t>Mechanics built and run on the November 2025 book; the figure awaits Dr Thom's confirmation of D30 and the monthly books</w:t>
+              <w:t>Built and run on the November 2025 book; Financial Modelling / Mega Farm Programme shows the book by scheme and stage, the settings in force and each run with its basis or declined reason; the figure awaits Dr Thom's confirmation of D30 and the monthly books</w:t>
             </w:r>
           </w:p>
         </w:tc>
@@ -2957,6 +2975,23 @@
                 <w:sz w:val="17"/>
               </w:rPr>
               <w:t>megafarm:ecl</w:t>
+            </w:r>
+            <w:r>
+              <w:rPr>
+                <w:b w:val="0"/>
+                <w:i w:val="0"/>
+                <w:sz w:val="17"/>
+              </w:rPr>
+              <w:t xml:space="preserve">, </w:t>
+            </w:r>
+            <w:r>
+              <w:rPr>
+                <w:rFonts w:ascii="Consolas" w:hAnsi="Consolas"/>
+                <w:b w:val="0"/>
+                <w:i w:val="0"/>
+                <w:sz w:val="17"/>
+              </w:rPr>
+              <w:t>Pages/MegaFarm/Index.vue</w:t>
             </w:r>
           </w:p>
         </w:tc>
@@ -6016,71 +6051,6 @@
                 <w:sz w:val="17"/>
               </w:rPr>
               <w:t>Ongoing: the shell and the shared classes carry the theme; pages that style elements directly are swept group by group as they are touched</w:t>
-            </w:r>
-          </w:p>
-        </w:tc>
-      </w:tr>
-      <w:tr>
-        <w:tc>
-          <w:tcPr>
-            <w:tcW w:type="dxa" w:w="3324"/>
-          </w:tcPr>
-          <w:p>
-            <w:r>
-              <w:rPr>
-                <w:b w:val="0"/>
-                <w:sz w:val="17"/>
-              </w:rPr>
-            </w:r>
-            <w:r>
-              <w:rPr>
-                <w:b w:val="0"/>
-                <w:i w:val="0"/>
-                <w:sz w:val="17"/>
-              </w:rPr>
-              <w:t>The Mega Farm screen; the method cards beside the Governance Centre setting</w:t>
-            </w:r>
-          </w:p>
-        </w:tc>
-        <w:tc>
-          <w:tcPr>
-            <w:tcW w:type="dxa" w:w="3324"/>
-          </w:tcPr>
-          <w:p>
-            <w:r>
-              <w:rPr>
-                <w:b w:val="0"/>
-                <w:sz w:val="17"/>
-              </w:rPr>
-            </w:r>
-            <w:r>
-              <w:rPr>
-                <w:b w:val="0"/>
-                <w:i w:val="0"/>
-                <w:sz w:val="17"/>
-              </w:rPr>
-              <w:t>16, 14.7</w:t>
-            </w:r>
-          </w:p>
-        </w:tc>
-        <w:tc>
-          <w:tcPr>
-            <w:tcW w:type="dxa" w:w="3324"/>
-          </w:tcPr>
-          <w:p>
-            <w:r>
-              <w:rPr>
-                <w:b w:val="0"/>
-                <w:sz w:val="17"/>
-              </w:rPr>
-            </w:r>
-            <w:r>
-              <w:rPr>
-                <w:b w:val="0"/>
-                <w:i w:val="0"/>
-                <w:sz w:val="17"/>
-              </w:rPr>
-              <w:t>Small screen work; the cards are on the FLI Adjustments screen and the JSON route</w:t>
             </w:r>
           </w:p>
         </w:tc>

</xml_diff>

<commit_message>
Audit closures recorded; After Build Report figures restated on the IFRS 9 basis
The audit's steps 1 to 7 are marked done with their commits, each closed finding carries its commit, and section 8 restates the clean-install figures: ECL 9.51bn (Stage 1 1.64bn, Stage 2 3.40bn, Stage 3 5.18bn), sensitivity base equal to the allowance and weighted 9.88bn, stress base 9.51bn and severe 11.51bn, Stage 3 interest on the net amount, 27 locked EIRs, 32 facilities solved with their tranches. The After Build Report's section 3 carries the same restatement with the earlier figures beside it.

Co-Authored-By: Claude Fable 5.1 <noreply@anthropic.com>
</commit_message>
<xml_diff>
--- a/docs/MAIIC_After_Build_Report_2026-10-08.docx
+++ b/docs/MAIIC_After_Build_Report_2026-10-08.docx
@@ -3692,7 +3692,7 @@
                 <w:i w:val="0"/>
                 <w:sz w:val="17"/>
               </w:rPr>
-              <w:t>138 roll-forward rows, 12 contracts, January 2025 to August 2026; 107 months take their cash from the ledger</w:t>
+              <w:t>483 roll-forward rows, 27 contracts, July 2024 to August 2026; 480 months take their cash from the ledger (3 from the schedule, outside the feed's coverage). Stage 3 interest on the net carrying amount: on the nine locked Stage 3 contracts at August 2026 an opening allowance of 1.00bn is netted, interest 17.3m, unwind 21.9m disclosed (restated 9 October 2026 after the system audit, C5 and C6)</w:t>
             </w:r>
           </w:p>
         </w:tc>
@@ -3780,7 +3780,7 @@
                 <w:i w:val="0"/>
                 <w:sz w:val="17"/>
               </w:rPr>
-              <w:t>August 2026 computed on the pre-FLI PD</w:t>
+              <w:t>A PD, an LGD and a pre-FLI ECL for every month from August 2024 (25 of 26 periods; July 2024 has no transition window), then August 2026 on the post-FLI PD, discounted through the time-phased engine on the 21 loans with a locked EIR</w:t>
             </w:r>
           </w:p>
         </w:tc>
@@ -3868,7 +3868,7 @@
                 <w:i w:val="0"/>
                 <w:sz w:val="17"/>
               </w:rPr>
-              <w:t>Cohort of 41 Stage 3 loans (4.12bn) followed twelve months: cure 21.2%, recovery 23.5%, LGD 60.25%</w:t>
+              <w:t>Cohort of 41 Stage 3 loans (4.12bn) followed twelve months: cure 21.2%, recovery 25.1% discounted at each loan's rate, LGD 59.06% (restated 9 October: cure and recovery exclusive, an absent loan a write-off unless settled)</w:t>
             </w:r>
           </w:p>
         </w:tc>
@@ -3908,11 +3908,19 @@
             </w:r>
             <w:r>
               <w:rPr>
-                <w:b w:val="0"/>
-                <w:i w:val="0"/>
-                <w:sz w:val="17"/>
-              </w:rPr>
-              <w:t>8.33bn on 23.32bn gross: Stage 1 1.58bn, Stage 2 1.82bn, Stage 3 4.93bn</w:t>
+                <w:b/>
+                <w:i w:val="0"/>
+                <w:sz w:val="17"/>
+              </w:rPr>
+              <w:t>9.51bn</w:t>
+            </w:r>
+            <w:r>
+              <w:rPr>
+                <w:b w:val="0"/>
+                <w:i w:val="0"/>
+                <w:sz w:val="17"/>
+              </w:rPr>
+              <w:t xml:space="preserve"> on 23.32bn gross: Stage 1 1.64bn (12-month PD), Stage 2 3.40bn (lifetime PD over the remaining months), Stage 3 5.18bn (PD 1, LGD 59.06%). Before the system audit of 9 October the figure was 8.33bn pre-FLI / 8.94bn post-FLI, with Stage 2 on the 12-month PD and a fit the bootstrap had approved itself</w:t>
             </w:r>
           </w:p>
         </w:tc>
@@ -3956,7 +3964,7 @@
                 <w:i w:val="0"/>
                 <w:sz w:val="17"/>
               </w:rPr>
-              <w:t>The first set of 15.8 approved under the bootstrap label; sensitivity on 135 loans: base 9.63bn, upside 9.00bn, downside 11.10bn, severe 12.99bn, weighted 10.24bn</w:t>
+              <w:t>The first set of 15.8 approved under the bootstrap label; sensitivity on 135 loans from the booked ECL per loan scaled by each scenario's stage PD: base 9.51bn (equals the allowance), upside 9.06bn, downside 10.45bn, severe 11.51bn, weighted 9.88bn</w:t>
             </w:r>
           </w:p>
         </w:tc>
@@ -4000,7 +4008,7 @@
                 <w:i w:val="0"/>
                 <w:sz w:val="17"/>
               </w:rPr>
-              <w:t>The best applied fit on a book-level proxy (the PLR to the Stage 3 share, lag 9) approved under the label; adjustments of -8.7% upside, +21.8% downside, +34.9% severe; the ECL on the post-FLI PD 8.94bn</w:t>
+              <w:t>No fit is approved on a clean install (spec 6.10.1 step 6): the overlay is zero and the PD holds, marked so on every loan. The sweep still ranks 209 fits from 1,045 evaluations; the best (the PLR to the Stage 3 share, lag 9) waits for two people on the FLI Adjustments screen. Before 9 October the bootstrap approved it itself</w:t>
             </w:r>
           </w:p>
         </w:tc>
@@ -4044,7 +4052,7 @@
                 <w:i w:val="0"/>
                 <w:sz w:val="17"/>
               </w:rPr>
-              <w:t>The set's scenarios as saved runs: base 8.94bn, upside 8.31bn (-7.1%), downside 10.22bn (+14.3%), severe 11.86bn (+32.7%)</w:t>
+              <w:t>The set's scenarios as saved runs on the ECL basis: base 9.51bn (equals the allowance), upside 9.06bn (-4.8%), downside 10.45bn (+9.9%), severe 11.51bn (+21.1%)</w:t>
             </w:r>
           </w:p>
         </w:tc>

</xml_diff>

<commit_message>
Audit step 8 recorded; figures restated after the merge
The four step-8 branches merged at 2903d66 close M1 to M7, M10 to M14 and M16; M18 waits on D30. The clean install at August 2026 now reads ECL 10.00bn (PD on the measured stage: Stage 1 45.0 percent, Stage 2 30.5 percent; a three-month cure period holds six loans), the pack's gates report their counts, 21 trial-balance files land through the door, golden ties 9 of 9 in 140 seconds. The After Build Report carries the same figures with the earlier ones beside them.

Co-Authored-By: Claude Fable 5.1 <noreply@anthropic.com>
</commit_message>
<xml_diff>
--- a/docs/MAIIC_After_Build_Report_2026-10-08.docx
+++ b/docs/MAIIC_After_Build_Report_2026-10-08.docx
@@ -3736,7 +3736,7 @@
                 <w:i w:val="0"/>
                 <w:sz w:val="17"/>
               </w:rPr>
-              <w:t>26 periods; 1,267 / 454 / 1,028 row-months in Stages 1, 2, 3</w:t>
+              <w:t>26 periods; 1,122 / 528 / 1,099 row-months in Stages 1, 2, 3 under the governed three-month cure period (1,267 / 454 / 1,028 with no probation)</w:t>
             </w:r>
           </w:p>
         </w:tc>
@@ -3824,7 +3824,7 @@
                 <w:i w:val="0"/>
                 <w:sz w:val="17"/>
               </w:rPr>
-              <w:t>Transition matrix over August 2025 to August 2026 (108 transitions): PD to Stage 3 of 35.9% from Stage 1 and 35.2% from Stage 2</w:t>
+              <w:t>Transition matrix over August 2025 to August 2026 (108 transitions) on the measured (post-qualitative) stage at both ends, a loan leaving the book counted as paid only when its last row shows it settled: PD to Stage 3 of 45.0% from Stage 1 and 30.5% from Stage 2 (35.9% and 35.2% on the DPD-only stage before audit step 8)</w:t>
             </w:r>
           </w:p>
         </w:tc>
@@ -3905,6 +3905,22 @@
                 <w:b w:val="0"/>
                 <w:sz w:val="17"/>
               </w:rPr>
+            </w:r>
+            <w:r>
+              <w:rPr>
+                <w:b/>
+                <w:i w:val="0"/>
+                <w:sz w:val="17"/>
+              </w:rPr>
+              <w:t>10.00bn</w:t>
+            </w:r>
+            <w:r>
+              <w:rPr>
+                <w:b w:val="0"/>
+                <w:i w:val="0"/>
+                <w:sz w:val="17"/>
+              </w:rPr>
+              <w:t xml:space="preserve"> after audit step 8 (PD on the measured stage; a three-month cure period holds six loans): Stage 1 1.47bn, Stage 2 2.76bn, Stage 3 5.77bn. After steps 1 to 7 it was </w:t>
             </w:r>
             <w:r>
               <w:rPr>

</xml_diff>